<commit_message>
update de archivos de entrega - luego hay que filtrar
Hubo un update de los archivos de avance, mas tarde hay que filtrar y nos quedaremos con lo necesario
</commit_message>
<xml_diff>
--- a/Fase 2/Evidencias Proyecto/Reporte de avances/2.3_APT122_FormativaAvance Fase2 REAL.docx
+++ b/Fase 2/Evidencias Proyecto/Reporte de avances/2.3_APT122_FormativaAvance Fase2 REAL.docx
@@ -4,6 +4,1550 @@
   <w:body>
     <w:p>
       <w:pPr>
+        <w:pStyle w:val="Title"/>
+        <w:spacing w:line="360" w:lineRule="auto"/>
+        <w:rPr>
+          <w:rFonts w:ascii="Calibri" w:cs="Calibri" w:eastAsia="Calibri" w:hAnsi="Calibri"/>
+        </w:rPr>
+      </w:pPr>
+      <w:bookmarkStart w:colFirst="0" w:colLast="0" w:name="_m3n8knhpvpa9" w:id="0"/>
+      <w:bookmarkEnd w:id="0"/>
+      <w:r>
+        <w:rPr>
+          <w:rtl w:val="0"/>
+        </w:rPr>
+      </w:r>
+    </w:p>
+    <w:p>
+      <w:pPr>
+        <w:pStyle w:val="Title"/>
+        <w:spacing w:line="360" w:lineRule="auto"/>
+        <w:jc w:val="center"/>
+        <w:rPr>
+          <w:rFonts w:ascii="Calibri" w:cs="Calibri" w:eastAsia="Calibri" w:hAnsi="Calibri"/>
+        </w:rPr>
+      </w:pPr>
+      <w:bookmarkStart w:colFirst="0" w:colLast="0" w:name="_4ck3y1ftks9p" w:id="1"/>
+      <w:bookmarkEnd w:id="1"/>
+      <w:r>
+        <w:rPr>
+          <w:rtl w:val="0"/>
+        </w:rPr>
+      </w:r>
+    </w:p>
+    <w:p>
+      <w:pPr>
+        <w:pStyle w:val="Title"/>
+        <w:spacing w:line="360" w:lineRule="auto"/>
+        <w:jc w:val="center"/>
+        <w:rPr>
+          <w:rFonts w:ascii="Calibri" w:cs="Calibri" w:eastAsia="Calibri" w:hAnsi="Calibri"/>
+          <w:b w:val="1"/>
+          <w:sz w:val="70"/>
+          <w:szCs w:val="70"/>
+        </w:rPr>
+      </w:pPr>
+      <w:bookmarkStart w:colFirst="0" w:colLast="0" w:name="_dqf9y4qvvk5i" w:id="2"/>
+      <w:bookmarkEnd w:id="2"/>
+      <w:r>
+        <w:rPr>
+          <w:rFonts w:ascii="Calibri" w:cs="Calibri" w:eastAsia="Calibri" w:hAnsi="Calibri"/>
+          <w:b w:val="1"/>
+          <w:sz w:val="70"/>
+          <w:szCs w:val="70"/>
+          <w:rtl w:val="0"/>
+        </w:rPr>
+        <w:t xml:space="preserve">Finnwey</w:t>
+      </w:r>
+    </w:p>
+    <w:p>
+      <w:pPr>
+        <w:spacing w:line="360" w:lineRule="auto"/>
+        <w:rPr>
+          <w:rFonts w:ascii="Calibri" w:cs="Calibri" w:eastAsia="Calibri" w:hAnsi="Calibri"/>
+          <w:sz w:val="24"/>
+          <w:szCs w:val="24"/>
+        </w:rPr>
+      </w:pPr>
+      <w:r>
+        <w:rPr>
+          <w:rtl w:val="0"/>
+        </w:rPr>
+      </w:r>
+    </w:p>
+    <w:p>
+      <w:pPr>
+        <w:spacing w:line="360" w:lineRule="auto"/>
+        <w:rPr>
+          <w:rFonts w:ascii="Calibri" w:cs="Calibri" w:eastAsia="Calibri" w:hAnsi="Calibri"/>
+          <w:sz w:val="24"/>
+          <w:szCs w:val="24"/>
+        </w:rPr>
+      </w:pPr>
+      <w:r>
+        <w:rPr>
+          <w:rtl w:val="0"/>
+        </w:rPr>
+      </w:r>
+    </w:p>
+    <w:p>
+      <w:pPr>
+        <w:spacing w:line="360" w:lineRule="auto"/>
+        <w:rPr>
+          <w:rFonts w:ascii="Calibri" w:cs="Calibri" w:eastAsia="Calibri" w:hAnsi="Calibri"/>
+          <w:sz w:val="24"/>
+          <w:szCs w:val="24"/>
+        </w:rPr>
+      </w:pPr>
+      <w:r>
+        <w:rPr>
+          <w:rtl w:val="0"/>
+        </w:rPr>
+      </w:r>
+    </w:p>
+    <w:p>
+      <w:pPr>
+        <w:spacing w:line="360" w:lineRule="auto"/>
+        <w:rPr>
+          <w:rFonts w:ascii="Calibri" w:cs="Calibri" w:eastAsia="Calibri" w:hAnsi="Calibri"/>
+          <w:sz w:val="24"/>
+          <w:szCs w:val="24"/>
+        </w:rPr>
+      </w:pPr>
+      <w:r>
+        <w:rPr>
+          <w:rtl w:val="0"/>
+        </w:rPr>
+      </w:r>
+    </w:p>
+    <w:p>
+      <w:pPr>
+        <w:spacing w:line="360" w:lineRule="auto"/>
+        <w:rPr>
+          <w:rFonts w:ascii="Calibri" w:cs="Calibri" w:eastAsia="Calibri" w:hAnsi="Calibri"/>
+          <w:sz w:val="24"/>
+          <w:szCs w:val="24"/>
+        </w:rPr>
+      </w:pPr>
+      <w:r>
+        <w:rPr>
+          <w:rtl w:val="0"/>
+        </w:rPr>
+      </w:r>
+    </w:p>
+    <w:p>
+      <w:pPr>
+        <w:spacing w:line="360" w:lineRule="auto"/>
+        <w:rPr>
+          <w:rFonts w:ascii="Calibri" w:cs="Calibri" w:eastAsia="Calibri" w:hAnsi="Calibri"/>
+          <w:sz w:val="24"/>
+          <w:szCs w:val="24"/>
+        </w:rPr>
+      </w:pPr>
+      <w:r>
+        <w:rPr>
+          <w:rtl w:val="0"/>
+        </w:rPr>
+      </w:r>
+    </w:p>
+    <w:p>
+      <w:pPr>
+        <w:spacing w:line="360" w:lineRule="auto"/>
+        <w:rPr>
+          <w:rFonts w:ascii="Calibri" w:cs="Calibri" w:eastAsia="Calibri" w:hAnsi="Calibri"/>
+          <w:sz w:val="24"/>
+          <w:szCs w:val="24"/>
+        </w:rPr>
+      </w:pPr>
+      <w:r>
+        <w:rPr>
+          <w:rtl w:val="0"/>
+        </w:rPr>
+      </w:r>
+    </w:p>
+    <w:p>
+      <w:pPr>
+        <w:spacing w:line="360" w:lineRule="auto"/>
+        <w:rPr>
+          <w:rFonts w:ascii="Calibri" w:cs="Calibri" w:eastAsia="Calibri" w:hAnsi="Calibri"/>
+          <w:sz w:val="24"/>
+          <w:szCs w:val="24"/>
+        </w:rPr>
+      </w:pPr>
+      <w:r>
+        <w:rPr>
+          <w:rtl w:val="0"/>
+        </w:rPr>
+      </w:r>
+    </w:p>
+    <w:p>
+      <w:pPr>
+        <w:spacing w:line="360" w:lineRule="auto"/>
+        <w:rPr>
+          <w:rFonts w:ascii="Calibri" w:cs="Calibri" w:eastAsia="Calibri" w:hAnsi="Calibri"/>
+          <w:sz w:val="24"/>
+          <w:szCs w:val="24"/>
+        </w:rPr>
+      </w:pPr>
+      <w:r>
+        <w:rPr>
+          <w:rtl w:val="0"/>
+        </w:rPr>
+      </w:r>
+    </w:p>
+    <w:p>
+      <w:pPr>
+        <w:spacing w:line="360" w:lineRule="auto"/>
+        <w:jc w:val="right"/>
+        <w:rPr>
+          <w:rFonts w:ascii="Calibri" w:cs="Calibri" w:eastAsia="Calibri" w:hAnsi="Calibri"/>
+          <w:b w:val="1"/>
+          <w:sz w:val="24"/>
+          <w:szCs w:val="24"/>
+        </w:rPr>
+      </w:pPr>
+      <w:r>
+        <w:rPr>
+          <w:rFonts w:ascii="Calibri" w:cs="Calibri" w:eastAsia="Calibri" w:hAnsi="Calibri"/>
+          <w:b w:val="1"/>
+          <w:sz w:val="24"/>
+          <w:szCs w:val="24"/>
+          <w:rtl w:val="0"/>
+        </w:rPr>
+        <w:t xml:space="preserve">Integrantes:</w:t>
+      </w:r>
+    </w:p>
+    <w:p>
+      <w:pPr>
+        <w:spacing w:line="360" w:lineRule="auto"/>
+        <w:jc w:val="right"/>
+        <w:rPr>
+          <w:rFonts w:ascii="Calibri" w:cs="Calibri" w:eastAsia="Calibri" w:hAnsi="Calibri"/>
+          <w:sz w:val="24"/>
+          <w:szCs w:val="24"/>
+        </w:rPr>
+      </w:pPr>
+      <w:r>
+        <w:rPr>
+          <w:rFonts w:ascii="Calibri" w:cs="Calibri" w:eastAsia="Calibri" w:hAnsi="Calibri"/>
+          <w:sz w:val="24"/>
+          <w:szCs w:val="24"/>
+          <w:rtl w:val="0"/>
+        </w:rPr>
+        <w:t xml:space="preserve">Brayan Gatica</w:t>
+      </w:r>
+    </w:p>
+    <w:p>
+      <w:pPr>
+        <w:spacing w:line="360" w:lineRule="auto"/>
+        <w:jc w:val="right"/>
+        <w:rPr>
+          <w:rFonts w:ascii="Calibri" w:cs="Calibri" w:eastAsia="Calibri" w:hAnsi="Calibri"/>
+          <w:sz w:val="24"/>
+          <w:szCs w:val="24"/>
+        </w:rPr>
+      </w:pPr>
+      <w:r>
+        <w:rPr>
+          <w:rFonts w:ascii="Calibri" w:cs="Calibri" w:eastAsia="Calibri" w:hAnsi="Calibri"/>
+          <w:sz w:val="24"/>
+          <w:szCs w:val="24"/>
+          <w:rtl w:val="0"/>
+        </w:rPr>
+        <w:t xml:space="preserve">Matias Gonzalez</w:t>
+      </w:r>
+    </w:p>
+    <w:p>
+      <w:pPr>
+        <w:spacing w:line="360" w:lineRule="auto"/>
+        <w:jc w:val="right"/>
+        <w:rPr>
+          <w:rFonts w:ascii="Calibri" w:cs="Calibri" w:eastAsia="Calibri" w:hAnsi="Calibri"/>
+          <w:sz w:val="24"/>
+          <w:szCs w:val="24"/>
+        </w:rPr>
+      </w:pPr>
+      <w:r>
+        <w:rPr>
+          <w:rFonts w:ascii="Calibri" w:cs="Calibri" w:eastAsia="Calibri" w:hAnsi="Calibri"/>
+          <w:sz w:val="24"/>
+          <w:szCs w:val="24"/>
+          <w:rtl w:val="0"/>
+        </w:rPr>
+        <w:t xml:space="preserve">Felipe Valdebenito</w:t>
+      </w:r>
+    </w:p>
+    <w:p>
+      <w:pPr>
+        <w:spacing w:line="360" w:lineRule="auto"/>
+        <w:jc w:val="right"/>
+        <w:rPr>
+          <w:rFonts w:ascii="Calibri" w:cs="Calibri" w:eastAsia="Calibri" w:hAnsi="Calibri"/>
+          <w:b w:val="1"/>
+          <w:sz w:val="24"/>
+          <w:szCs w:val="24"/>
+        </w:rPr>
+      </w:pPr>
+      <w:r>
+        <w:rPr>
+          <w:rFonts w:ascii="Calibri" w:cs="Calibri" w:eastAsia="Calibri" w:hAnsi="Calibri"/>
+          <w:b w:val="1"/>
+          <w:sz w:val="24"/>
+          <w:szCs w:val="24"/>
+          <w:rtl w:val="0"/>
+        </w:rPr>
+        <w:t xml:space="preserve">Asignatura:</w:t>
+      </w:r>
+    </w:p>
+    <w:p>
+      <w:pPr>
+        <w:spacing w:line="360" w:lineRule="auto"/>
+        <w:jc w:val="right"/>
+        <w:rPr>
+          <w:rFonts w:ascii="Calibri" w:cs="Calibri" w:eastAsia="Calibri" w:hAnsi="Calibri"/>
+          <w:sz w:val="24"/>
+          <w:szCs w:val="24"/>
+        </w:rPr>
+      </w:pPr>
+      <w:r>
+        <w:rPr>
+          <w:rFonts w:ascii="Calibri" w:cs="Calibri" w:eastAsia="Calibri" w:hAnsi="Calibri"/>
+          <w:sz w:val="24"/>
+          <w:szCs w:val="24"/>
+          <w:rtl w:val="0"/>
+        </w:rPr>
+        <w:t xml:space="preserve">PTY4614_001D</w:t>
+      </w:r>
+    </w:p>
+    <w:p>
+      <w:pPr>
+        <w:spacing w:line="360" w:lineRule="auto"/>
+        <w:jc w:val="right"/>
+        <w:rPr>
+          <w:rFonts w:ascii="Calibri" w:cs="Calibri" w:eastAsia="Calibri" w:hAnsi="Calibri"/>
+          <w:b w:val="1"/>
+          <w:sz w:val="24"/>
+          <w:szCs w:val="24"/>
+        </w:rPr>
+      </w:pPr>
+      <w:r>
+        <w:rPr>
+          <w:rFonts w:ascii="Calibri" w:cs="Calibri" w:eastAsia="Calibri" w:hAnsi="Calibri"/>
+          <w:b w:val="1"/>
+          <w:sz w:val="24"/>
+          <w:szCs w:val="24"/>
+          <w:rtl w:val="0"/>
+        </w:rPr>
+        <w:t xml:space="preserve">Docentes:</w:t>
+      </w:r>
+    </w:p>
+    <w:p>
+      <w:pPr>
+        <w:spacing w:line="360" w:lineRule="auto"/>
+        <w:jc w:val="right"/>
+        <w:rPr>
+          <w:rFonts w:ascii="Calibri" w:cs="Calibri" w:eastAsia="Calibri" w:hAnsi="Calibri"/>
+          <w:sz w:val="24"/>
+          <w:szCs w:val="24"/>
+        </w:rPr>
+      </w:pPr>
+      <w:r>
+        <w:rPr>
+          <w:rFonts w:ascii="Calibri" w:cs="Calibri" w:eastAsia="Calibri" w:hAnsi="Calibri"/>
+          <w:sz w:val="24"/>
+          <w:szCs w:val="24"/>
+          <w:rtl w:val="0"/>
+        </w:rPr>
+        <w:t xml:space="preserve">Jazna Meza Hidalgo</w:t>
+      </w:r>
+    </w:p>
+    <w:p>
+      <w:pPr>
+        <w:spacing w:line="360" w:lineRule="auto"/>
+        <w:jc w:val="right"/>
+        <w:rPr>
+          <w:rFonts w:ascii="Calibri" w:cs="Calibri" w:eastAsia="Calibri" w:hAnsi="Calibri"/>
+          <w:sz w:val="24"/>
+          <w:szCs w:val="24"/>
+        </w:rPr>
+      </w:pPr>
+      <w:r>
+        <w:rPr>
+          <w:rFonts w:ascii="Calibri" w:cs="Calibri" w:eastAsia="Calibri" w:hAnsi="Calibri"/>
+          <w:sz w:val="24"/>
+          <w:szCs w:val="24"/>
+          <w:rtl w:val="0"/>
+        </w:rPr>
+        <w:t xml:space="preserve">Juan Mellado Alarcón</w:t>
+      </w:r>
+    </w:p>
+    <w:p>
+      <w:pPr>
+        <w:spacing w:line="360" w:lineRule="auto"/>
+        <w:jc w:val="right"/>
+        <w:rPr>
+          <w:rFonts w:ascii="Calibri" w:cs="Calibri" w:eastAsia="Calibri" w:hAnsi="Calibri"/>
+          <w:b w:val="1"/>
+          <w:sz w:val="24"/>
+          <w:szCs w:val="24"/>
+        </w:rPr>
+      </w:pPr>
+      <w:r>
+        <w:rPr>
+          <w:rFonts w:ascii="Calibri" w:cs="Calibri" w:eastAsia="Calibri" w:hAnsi="Calibri"/>
+          <w:b w:val="1"/>
+          <w:sz w:val="24"/>
+          <w:szCs w:val="24"/>
+          <w:rtl w:val="0"/>
+        </w:rPr>
+        <w:t xml:space="preserve">Fecha:</w:t>
+      </w:r>
+    </w:p>
+    <w:p>
+      <w:pPr>
+        <w:spacing w:line="360" w:lineRule="auto"/>
+        <w:jc w:val="right"/>
+        <w:rPr>
+          <w:rFonts w:ascii="Calibri" w:cs="Calibri" w:eastAsia="Calibri" w:hAnsi="Calibri"/>
+          <w:sz w:val="24"/>
+          <w:szCs w:val="24"/>
+        </w:rPr>
+      </w:pPr>
+      <w:r>
+        <w:rPr>
+          <w:rFonts w:ascii="Calibri" w:cs="Calibri" w:eastAsia="Calibri" w:hAnsi="Calibri"/>
+          <w:sz w:val="24"/>
+          <w:szCs w:val="24"/>
+          <w:rtl w:val="0"/>
+        </w:rPr>
+        <w:t xml:space="preserve">06/10/2025</w:t>
+      </w:r>
+    </w:p>
+    <w:p>
+      <w:pPr>
+        <w:spacing w:line="360" w:lineRule="auto"/>
+        <w:jc w:val="right"/>
+        <w:rPr>
+          <w:rFonts w:ascii="Calibri" w:cs="Calibri" w:eastAsia="Calibri" w:hAnsi="Calibri"/>
+          <w:sz w:val="24"/>
+          <w:szCs w:val="24"/>
+        </w:rPr>
+      </w:pPr>
+      <w:r>
+        <w:rPr>
+          <w:rtl w:val="0"/>
+        </w:rPr>
+      </w:r>
+    </w:p>
+    <w:p>
+      <w:pPr>
+        <w:spacing w:line="360" w:lineRule="auto"/>
+        <w:jc w:val="right"/>
+        <w:rPr>
+          <w:rFonts w:ascii="Calibri" w:cs="Calibri" w:eastAsia="Calibri" w:hAnsi="Calibri"/>
+          <w:sz w:val="24"/>
+          <w:szCs w:val="24"/>
+        </w:rPr>
+      </w:pPr>
+      <w:r>
+        <w:rPr>
+          <w:rtl w:val="0"/>
+        </w:rPr>
+      </w:r>
+    </w:p>
+    <w:p>
+      <w:pPr>
+        <w:spacing w:line="360" w:lineRule="auto"/>
+        <w:jc w:val="right"/>
+        <w:rPr>
+          <w:rFonts w:ascii="Calibri" w:cs="Calibri" w:eastAsia="Calibri" w:hAnsi="Calibri"/>
+          <w:sz w:val="24"/>
+          <w:szCs w:val="24"/>
+        </w:rPr>
+      </w:pPr>
+      <w:r>
+        <w:rPr>
+          <w:rtl w:val="0"/>
+        </w:rPr>
+      </w:r>
+    </w:p>
+    <w:p>
+      <w:pPr>
+        <w:spacing w:line="360" w:lineRule="auto"/>
+        <w:jc w:val="right"/>
+        <w:rPr>
+          <w:rFonts w:ascii="Calibri" w:cs="Calibri" w:eastAsia="Calibri" w:hAnsi="Calibri"/>
+          <w:sz w:val="24"/>
+          <w:szCs w:val="24"/>
+        </w:rPr>
+      </w:pPr>
+      <w:r>
+        <w:rPr>
+          <w:rtl w:val="0"/>
+        </w:rPr>
+      </w:r>
+    </w:p>
+    <w:p>
+      <w:pPr>
+        <w:spacing w:line="360" w:lineRule="auto"/>
+        <w:jc w:val="right"/>
+        <w:rPr>
+          <w:rFonts w:ascii="Calibri" w:cs="Calibri" w:eastAsia="Calibri" w:hAnsi="Calibri"/>
+          <w:sz w:val="24"/>
+          <w:szCs w:val="24"/>
+        </w:rPr>
+      </w:pPr>
+      <w:r>
+        <w:rPr>
+          <w:rtl w:val="0"/>
+        </w:rPr>
+      </w:r>
+    </w:p>
+    <w:p>
+      <w:pPr>
+        <w:spacing w:line="360" w:lineRule="auto"/>
+        <w:jc w:val="left"/>
+        <w:rPr>
+          <w:rFonts w:ascii="Calibri" w:cs="Calibri" w:eastAsia="Calibri" w:hAnsi="Calibri"/>
+          <w:sz w:val="24"/>
+          <w:szCs w:val="24"/>
+        </w:rPr>
+      </w:pPr>
+      <w:r>
+        <w:rPr>
+          <w:rtl w:val="0"/>
+        </w:rPr>
+      </w:r>
+    </w:p>
+    <w:p>
+      <w:pPr>
+        <w:spacing w:line="360" w:lineRule="auto"/>
+        <w:jc w:val="left"/>
+        <w:rPr>
+          <w:rFonts w:ascii="Calibri" w:cs="Calibri" w:eastAsia="Calibri" w:hAnsi="Calibri"/>
+          <w:sz w:val="24"/>
+          <w:szCs w:val="24"/>
+        </w:rPr>
+      </w:pPr>
+      <w:r>
+        <w:rPr>
+          <w:rtl w:val="0"/>
+        </w:rPr>
+      </w:r>
+    </w:p>
+    <w:p>
+      <w:pPr>
+        <w:spacing w:line="360" w:lineRule="auto"/>
+        <w:jc w:val="left"/>
+        <w:rPr>
+          <w:rFonts w:ascii="Calibri" w:cs="Calibri" w:eastAsia="Calibri" w:hAnsi="Calibri"/>
+          <w:sz w:val="24"/>
+          <w:szCs w:val="24"/>
+        </w:rPr>
+      </w:pPr>
+      <w:r>
+        <w:rPr>
+          <w:rtl w:val="0"/>
+        </w:rPr>
+      </w:r>
+    </w:p>
+    <w:p>
+      <w:pPr>
+        <w:spacing w:line="360" w:lineRule="auto"/>
+        <w:jc w:val="left"/>
+        <w:rPr>
+          <w:rFonts w:ascii="Calibri" w:cs="Calibri" w:eastAsia="Calibri" w:hAnsi="Calibri"/>
+          <w:sz w:val="24"/>
+          <w:szCs w:val="24"/>
+        </w:rPr>
+      </w:pPr>
+      <w:r>
+        <w:rPr>
+          <w:rtl w:val="0"/>
+        </w:rPr>
+      </w:r>
+    </w:p>
+    <w:p>
+      <w:pPr>
+        <w:spacing w:line="360" w:lineRule="auto"/>
+        <w:jc w:val="left"/>
+        <w:rPr>
+          <w:rFonts w:ascii="Calibri" w:cs="Calibri" w:eastAsia="Calibri" w:hAnsi="Calibri"/>
+          <w:sz w:val="24"/>
+          <w:szCs w:val="24"/>
+        </w:rPr>
+      </w:pPr>
+      <w:r>
+        <w:rPr>
+          <w:rtl w:val="0"/>
+        </w:rPr>
+      </w:r>
+    </w:p>
+    <w:sdt>
+      <w:sdtPr>
+        <w:id w:val="-196747416"/>
+        <w:docPartObj>
+          <w:docPartGallery w:val="Table of Contents"/>
+          <w:docPartUnique w:val="1"/>
+        </w:docPartObj>
+      </w:sdtPr>
+      <w:sdtContent>
+        <w:p>
+          <w:pPr>
+            <w:widowControl w:val="0"/>
+            <w:tabs>
+              <w:tab w:val="right" w:leader="none" w:pos="12000"/>
+            </w:tabs>
+            <w:spacing w:before="60" w:line="240" w:lineRule="auto"/>
+            <w:rPr>
+              <w:b w:val="1"/>
+              <w:color w:val="000000"/>
+              <w:u w:val="none"/>
+            </w:rPr>
+          </w:pPr>
+          <w:r>
+            <w:fldChar w:fldCharType="begin"/>
+            <w:instrText xml:space="preserve"> TOC \h \u \z \t "Heading 1,1,Heading 2,2,Heading 3,3,Heading 4,4,Heading 5,5,Heading 6,6,"</w:instrText>
+            <w:fldChar w:fldCharType="separate"/>
+          </w:r>
+          <w:hyperlink w:anchor="_36d6ofware0r">
+            <w:r>
+              <w:rPr>
+                <w:rFonts w:ascii="Arial" w:cs="Arial" w:eastAsia="Arial" w:hAnsi="Arial"/>
+                <w:b w:val="1"/>
+                <w:i w:val="0"/>
+                <w:smallCaps w:val="0"/>
+                <w:strike w:val="0"/>
+                <w:color w:val="000000"/>
+                <w:sz w:val="22"/>
+                <w:szCs w:val="22"/>
+                <w:u w:val="none"/>
+                <w:shd w:fill="auto" w:val="clear"/>
+                <w:vertAlign w:val="baseline"/>
+                <w:rtl w:val="0"/>
+              </w:rPr>
+              <w:t xml:space="preserve">1. Abstract</w:t>
+              <w:tab/>
+              <w:t xml:space="preserve">3</w:t>
+            </w:r>
+          </w:hyperlink>
+          <w:r>
+            <w:rPr>
+              <w:rtl w:val="0"/>
+            </w:rPr>
+          </w:r>
+        </w:p>
+        <w:p>
+          <w:pPr>
+            <w:widowControl w:val="0"/>
+            <w:tabs>
+              <w:tab w:val="right" w:leader="none" w:pos="12000"/>
+            </w:tabs>
+            <w:spacing w:before="60" w:line="240" w:lineRule="auto"/>
+            <w:rPr>
+              <w:b w:val="1"/>
+              <w:color w:val="000000"/>
+              <w:u w:val="none"/>
+            </w:rPr>
+          </w:pPr>
+          <w:hyperlink w:anchor="_ay9ryuwdvotd">
+            <w:r>
+              <w:rPr>
+                <w:rFonts w:ascii="Arial" w:cs="Arial" w:eastAsia="Arial" w:hAnsi="Arial"/>
+                <w:b w:val="0"/>
+                <w:i w:val="0"/>
+                <w:smallCaps w:val="0"/>
+                <w:strike w:val="0"/>
+                <w:color w:val="000000"/>
+                <w:sz w:val="22"/>
+                <w:szCs w:val="22"/>
+                <w:u w:val="none"/>
+                <w:shd w:fill="auto" w:val="clear"/>
+                <w:vertAlign w:val="baseline"/>
+                <w:rtl w:val="0"/>
+              </w:rPr>
+              <w:t xml:space="preserve">2. Ajustes a la propuesta</w:t>
+              <w:tab/>
+              <w:t xml:space="preserve">3</w:t>
+            </w:r>
+          </w:hyperlink>
+          <w:r>
+            <w:rPr>
+              <w:rtl w:val="0"/>
+            </w:rPr>
+          </w:r>
+        </w:p>
+        <w:p>
+          <w:pPr>
+            <w:widowControl w:val="0"/>
+            <w:tabs>
+              <w:tab w:val="right" w:leader="none" w:pos="12000"/>
+            </w:tabs>
+            <w:spacing w:before="60" w:line="240" w:lineRule="auto"/>
+            <w:ind w:left="360" w:firstLine="0"/>
+            <w:rPr>
+              <w:color w:val="000000"/>
+              <w:u w:val="none"/>
+            </w:rPr>
+          </w:pPr>
+          <w:hyperlink w:anchor="_ov8xdlwhbxw">
+            <w:r>
+              <w:rPr>
+                <w:rFonts w:ascii="Arial" w:cs="Arial" w:eastAsia="Arial" w:hAnsi="Arial"/>
+                <w:b w:val="0"/>
+                <w:i w:val="0"/>
+                <w:smallCaps w:val="0"/>
+                <w:strike w:val="0"/>
+                <w:color w:val="000000"/>
+                <w:sz w:val="22"/>
+                <w:szCs w:val="22"/>
+                <w:u w:val="none"/>
+                <w:shd w:fill="auto" w:val="clear"/>
+                <w:vertAlign w:val="baseline"/>
+                <w:rtl w:val="0"/>
+              </w:rPr>
+              <w:t xml:space="preserve">2.1 Dificultades</w:t>
+              <w:tab/>
+              <w:t xml:space="preserve">3</w:t>
+            </w:r>
+          </w:hyperlink>
+          <w:r>
+            <w:rPr>
+              <w:rtl w:val="0"/>
+            </w:rPr>
+          </w:r>
+        </w:p>
+        <w:p>
+          <w:pPr>
+            <w:widowControl w:val="0"/>
+            <w:tabs>
+              <w:tab w:val="right" w:leader="none" w:pos="12000"/>
+            </w:tabs>
+            <w:spacing w:before="60" w:line="240" w:lineRule="auto"/>
+            <w:ind w:left="360" w:firstLine="0"/>
+            <w:rPr>
+              <w:color w:val="000000"/>
+              <w:u w:val="none"/>
+            </w:rPr>
+          </w:pPr>
+          <w:hyperlink w:anchor="_z1el72tvqm2k">
+            <w:r>
+              <w:rPr>
+                <w:rFonts w:ascii="Arial" w:cs="Arial" w:eastAsia="Arial" w:hAnsi="Arial"/>
+                <w:b w:val="0"/>
+                <w:i w:val="0"/>
+                <w:smallCaps w:val="0"/>
+                <w:strike w:val="0"/>
+                <w:color w:val="000000"/>
+                <w:sz w:val="22"/>
+                <w:szCs w:val="22"/>
+                <w:u w:val="none"/>
+                <w:shd w:fill="auto" w:val="clear"/>
+                <w:vertAlign w:val="baseline"/>
+                <w:rtl w:val="0"/>
+              </w:rPr>
+              <w:t xml:space="preserve">2.2 Facilitadores</w:t>
+              <w:tab/>
+              <w:t xml:space="preserve">3</w:t>
+            </w:r>
+          </w:hyperlink>
+          <w:r>
+            <w:rPr>
+              <w:rtl w:val="0"/>
+            </w:rPr>
+          </w:r>
+        </w:p>
+        <w:p>
+          <w:pPr>
+            <w:widowControl w:val="0"/>
+            <w:tabs>
+              <w:tab w:val="right" w:leader="none" w:pos="12000"/>
+            </w:tabs>
+            <w:spacing w:before="60" w:line="240" w:lineRule="auto"/>
+            <w:ind w:left="360" w:firstLine="0"/>
+            <w:rPr>
+              <w:color w:val="000000"/>
+              <w:u w:val="none"/>
+            </w:rPr>
+          </w:pPr>
+          <w:hyperlink w:anchor="_tlaro3xgidfo">
+            <w:r>
+              <w:rPr>
+                <w:rFonts w:ascii="Arial" w:cs="Arial" w:eastAsia="Arial" w:hAnsi="Arial"/>
+                <w:b w:val="0"/>
+                <w:i w:val="0"/>
+                <w:smallCaps w:val="0"/>
+                <w:strike w:val="0"/>
+                <w:color w:val="000000"/>
+                <w:sz w:val="22"/>
+                <w:szCs w:val="22"/>
+                <w:u w:val="none"/>
+                <w:shd w:fill="auto" w:val="clear"/>
+                <w:vertAlign w:val="baseline"/>
+                <w:rtl w:val="0"/>
+              </w:rPr>
+              <w:t xml:space="preserve">2.3 Retroalimentación recibida</w:t>
+              <w:tab/>
+              <w:t xml:space="preserve">3</w:t>
+            </w:r>
+          </w:hyperlink>
+          <w:r>
+            <w:rPr>
+              <w:rtl w:val="0"/>
+            </w:rPr>
+          </w:r>
+        </w:p>
+        <w:p>
+          <w:pPr>
+            <w:widowControl w:val="0"/>
+            <w:tabs>
+              <w:tab w:val="right" w:leader="none" w:pos="12000"/>
+            </w:tabs>
+            <w:spacing w:before="60" w:line="240" w:lineRule="auto"/>
+            <w:ind w:left="360" w:firstLine="0"/>
+            <w:rPr>
+              <w:color w:val="000000"/>
+              <w:u w:val="none"/>
+            </w:rPr>
+          </w:pPr>
+          <w:hyperlink w:anchor="_o8gxho8xwpb4">
+            <w:r>
+              <w:rPr>
+                <w:rFonts w:ascii="Arial" w:cs="Arial" w:eastAsia="Arial" w:hAnsi="Arial"/>
+                <w:b w:val="0"/>
+                <w:i w:val="0"/>
+                <w:smallCaps w:val="0"/>
+                <w:strike w:val="0"/>
+                <w:color w:val="000000"/>
+                <w:sz w:val="22"/>
+                <w:szCs w:val="22"/>
+                <w:u w:val="none"/>
+                <w:shd w:fill="auto" w:val="clear"/>
+                <w:vertAlign w:val="baseline"/>
+                <w:rtl w:val="0"/>
+              </w:rPr>
+              <w:t xml:space="preserve">2.4 Cambios técnicos implementados</w:t>
+              <w:tab/>
+              <w:t xml:space="preserve">3</w:t>
+            </w:r>
+          </w:hyperlink>
+          <w:r>
+            <w:rPr>
+              <w:rtl w:val="0"/>
+            </w:rPr>
+          </w:r>
+        </w:p>
+        <w:p>
+          <w:pPr>
+            <w:widowControl w:val="0"/>
+            <w:tabs>
+              <w:tab w:val="right" w:leader="none" w:pos="12000"/>
+            </w:tabs>
+            <w:spacing w:before="60" w:line="240" w:lineRule="auto"/>
+            <w:rPr>
+              <w:b w:val="1"/>
+              <w:color w:val="000000"/>
+              <w:u w:val="none"/>
+            </w:rPr>
+          </w:pPr>
+          <w:hyperlink w:anchor="_ye8n622i17fi">
+            <w:r>
+              <w:rPr>
+                <w:rFonts w:ascii="Arial" w:cs="Arial" w:eastAsia="Arial" w:hAnsi="Arial"/>
+                <w:b w:val="0"/>
+                <w:i w:val="0"/>
+                <w:smallCaps w:val="0"/>
+                <w:strike w:val="0"/>
+                <w:color w:val="000000"/>
+                <w:sz w:val="22"/>
+                <w:szCs w:val="22"/>
+                <w:u w:val="none"/>
+                <w:shd w:fill="auto" w:val="clear"/>
+                <w:vertAlign w:val="baseline"/>
+                <w:rtl w:val="0"/>
+              </w:rPr>
+              <w:t xml:space="preserve">3. Metodología de trabajo</w:t>
+              <w:tab/>
+              <w:t xml:space="preserve">4</w:t>
+            </w:r>
+          </w:hyperlink>
+          <w:r>
+            <w:rPr>
+              <w:rtl w:val="0"/>
+            </w:rPr>
+          </w:r>
+        </w:p>
+        <w:p>
+          <w:pPr>
+            <w:widowControl w:val="0"/>
+            <w:tabs>
+              <w:tab w:val="right" w:leader="none" w:pos="12000"/>
+            </w:tabs>
+            <w:spacing w:before="60" w:line="240" w:lineRule="auto"/>
+            <w:ind w:left="360" w:firstLine="0"/>
+            <w:rPr>
+              <w:color w:val="000000"/>
+              <w:u w:val="none"/>
+            </w:rPr>
+          </w:pPr>
+          <w:hyperlink w:anchor="_8hzusig2h8bh">
+            <w:r>
+              <w:rPr>
+                <w:rFonts w:ascii="Arial" w:cs="Arial" w:eastAsia="Arial" w:hAnsi="Arial"/>
+                <w:b w:val="0"/>
+                <w:i w:val="0"/>
+                <w:smallCaps w:val="0"/>
+                <w:strike w:val="0"/>
+                <w:color w:val="000000"/>
+                <w:sz w:val="22"/>
+                <w:szCs w:val="22"/>
+                <w:u w:val="none"/>
+                <w:shd w:fill="auto" w:val="clear"/>
+                <w:vertAlign w:val="baseline"/>
+                <w:rtl w:val="0"/>
+              </w:rPr>
+              <w:t xml:space="preserve">3.1 Metodología aplicada</w:t>
+              <w:tab/>
+              <w:t xml:space="preserve">4</w:t>
+            </w:r>
+          </w:hyperlink>
+          <w:r>
+            <w:rPr>
+              <w:rtl w:val="0"/>
+            </w:rPr>
+          </w:r>
+        </w:p>
+        <w:p>
+          <w:pPr>
+            <w:widowControl w:val="0"/>
+            <w:tabs>
+              <w:tab w:val="right" w:leader="none" w:pos="12000"/>
+            </w:tabs>
+            <w:spacing w:before="60" w:line="240" w:lineRule="auto"/>
+            <w:ind w:left="360" w:firstLine="0"/>
+            <w:rPr>
+              <w:color w:val="000000"/>
+              <w:u w:val="none"/>
+            </w:rPr>
+          </w:pPr>
+          <w:hyperlink w:anchor="_8qvoayf7llyj">
+            <w:r>
+              <w:rPr>
+                <w:rFonts w:ascii="Arial" w:cs="Arial" w:eastAsia="Arial" w:hAnsi="Arial"/>
+                <w:b w:val="0"/>
+                <w:i w:val="0"/>
+                <w:smallCaps w:val="0"/>
+                <w:strike w:val="0"/>
+                <w:color w:val="000000"/>
+                <w:sz w:val="22"/>
+                <w:szCs w:val="22"/>
+                <w:u w:val="none"/>
+                <w:shd w:fill="auto" w:val="clear"/>
+                <w:vertAlign w:val="baseline"/>
+                <w:rtl w:val="0"/>
+              </w:rPr>
+              <w:t xml:space="preserve">3.2 Herramientas utilizadas</w:t>
+              <w:tab/>
+              <w:t xml:space="preserve">4</w:t>
+            </w:r>
+          </w:hyperlink>
+          <w:r>
+            <w:rPr>
+              <w:rtl w:val="0"/>
+            </w:rPr>
+          </w:r>
+        </w:p>
+        <w:p>
+          <w:pPr>
+            <w:widowControl w:val="0"/>
+            <w:tabs>
+              <w:tab w:val="right" w:leader="none" w:pos="12000"/>
+            </w:tabs>
+            <w:spacing w:before="60" w:line="240" w:lineRule="auto"/>
+            <w:ind w:left="360" w:firstLine="0"/>
+            <w:rPr>
+              <w:color w:val="000000"/>
+              <w:u w:val="none"/>
+            </w:rPr>
+          </w:pPr>
+          <w:hyperlink w:anchor="_abzq03kxp1n1">
+            <w:r>
+              <w:rPr>
+                <w:rFonts w:ascii="Arial" w:cs="Arial" w:eastAsia="Arial" w:hAnsi="Arial"/>
+                <w:b w:val="0"/>
+                <w:i w:val="0"/>
+                <w:smallCaps w:val="0"/>
+                <w:strike w:val="0"/>
+                <w:color w:val="000000"/>
+                <w:sz w:val="22"/>
+                <w:szCs w:val="22"/>
+                <w:u w:val="none"/>
+                <w:shd w:fill="auto" w:val="clear"/>
+                <w:vertAlign w:val="baseline"/>
+                <w:rtl w:val="0"/>
+              </w:rPr>
+              <w:t xml:space="preserve">3.3 Distribución de roles y tareas</w:t>
+              <w:tab/>
+              <w:t xml:space="preserve">4</w:t>
+            </w:r>
+          </w:hyperlink>
+          <w:r>
+            <w:rPr>
+              <w:rtl w:val="0"/>
+            </w:rPr>
+          </w:r>
+        </w:p>
+        <w:p>
+          <w:pPr>
+            <w:widowControl w:val="0"/>
+            <w:tabs>
+              <w:tab w:val="right" w:leader="none" w:pos="12000"/>
+            </w:tabs>
+            <w:spacing w:before="60" w:line="240" w:lineRule="auto"/>
+            <w:rPr>
+              <w:b w:val="1"/>
+              <w:color w:val="000000"/>
+              <w:u w:val="none"/>
+            </w:rPr>
+          </w:pPr>
+          <w:hyperlink w:anchor="_9tib86b2us3">
+            <w:r>
+              <w:rPr>
+                <w:rFonts w:ascii="Arial" w:cs="Arial" w:eastAsia="Arial" w:hAnsi="Arial"/>
+                <w:b w:val="0"/>
+                <w:i w:val="0"/>
+                <w:smallCaps w:val="0"/>
+                <w:strike w:val="0"/>
+                <w:color w:val="000000"/>
+                <w:sz w:val="22"/>
+                <w:szCs w:val="22"/>
+                <w:u w:val="none"/>
+                <w:shd w:fill="auto" w:val="clear"/>
+                <w:vertAlign w:val="baseline"/>
+                <w:rtl w:val="0"/>
+              </w:rPr>
+              <w:t xml:space="preserve">Pertinencia con los requerimientos disciplinares</w:t>
+              <w:tab/>
+              <w:t xml:space="preserve">5</w:t>
+            </w:r>
+          </w:hyperlink>
+          <w:r>
+            <w:rPr>
+              <w:rtl w:val="0"/>
+            </w:rPr>
+          </w:r>
+        </w:p>
+        <w:p>
+          <w:pPr>
+            <w:widowControl w:val="0"/>
+            <w:tabs>
+              <w:tab w:val="right" w:leader="none" w:pos="12000"/>
+            </w:tabs>
+            <w:spacing w:before="60" w:line="240" w:lineRule="auto"/>
+            <w:rPr>
+              <w:b w:val="1"/>
+              <w:color w:val="000000"/>
+              <w:u w:val="none"/>
+            </w:rPr>
+          </w:pPr>
+          <w:hyperlink w:anchor="_o699bo9n5qvg">
+            <w:r>
+              <w:rPr>
+                <w:rFonts w:ascii="Arial" w:cs="Arial" w:eastAsia="Arial" w:hAnsi="Arial"/>
+                <w:b w:val="0"/>
+                <w:i w:val="0"/>
+                <w:smallCaps w:val="0"/>
+                <w:strike w:val="0"/>
+                <w:color w:val="000000"/>
+                <w:sz w:val="22"/>
+                <w:szCs w:val="22"/>
+                <w:u w:val="none"/>
+                <w:shd w:fill="auto" w:val="clear"/>
+                <w:vertAlign w:val="baseline"/>
+                <w:rtl w:val="0"/>
+              </w:rPr>
+              <w:t xml:space="preserve">4. Desarrollo de ingeniería</w:t>
+              <w:tab/>
+              <w:t xml:space="preserve">5</w:t>
+            </w:r>
+          </w:hyperlink>
+          <w:r>
+            <w:rPr>
+              <w:rtl w:val="0"/>
+            </w:rPr>
+          </w:r>
+        </w:p>
+        <w:p>
+          <w:pPr>
+            <w:widowControl w:val="0"/>
+            <w:tabs>
+              <w:tab w:val="right" w:leader="none" w:pos="12000"/>
+            </w:tabs>
+            <w:spacing w:before="60" w:line="240" w:lineRule="auto"/>
+            <w:ind w:left="360" w:firstLine="0"/>
+            <w:rPr>
+              <w:color w:val="000000"/>
+              <w:u w:val="none"/>
+            </w:rPr>
+          </w:pPr>
+          <w:hyperlink w:anchor="_ltnys5hpqnsq">
+            <w:r>
+              <w:rPr>
+                <w:rFonts w:ascii="Arial" w:cs="Arial" w:eastAsia="Arial" w:hAnsi="Arial"/>
+                <w:b w:val="0"/>
+                <w:i w:val="0"/>
+                <w:smallCaps w:val="0"/>
+                <w:strike w:val="0"/>
+                <w:color w:val="000000"/>
+                <w:sz w:val="22"/>
+                <w:szCs w:val="22"/>
+                <w:u w:val="none"/>
+                <w:shd w:fill="auto" w:val="clear"/>
+                <w:vertAlign w:val="baseline"/>
+                <w:rtl w:val="0"/>
+              </w:rPr>
+              <w:t xml:space="preserve">4.1 Arquitectura del sistema</w:t>
+              <w:tab/>
+              <w:t xml:space="preserve">5</w:t>
+            </w:r>
+          </w:hyperlink>
+          <w:r>
+            <w:rPr>
+              <w:rtl w:val="0"/>
+            </w:rPr>
+          </w:r>
+        </w:p>
+        <w:p>
+          <w:pPr>
+            <w:widowControl w:val="0"/>
+            <w:tabs>
+              <w:tab w:val="right" w:leader="none" w:pos="12000"/>
+            </w:tabs>
+            <w:spacing w:before="60" w:line="240" w:lineRule="auto"/>
+            <w:ind w:left="360" w:firstLine="0"/>
+            <w:rPr>
+              <w:color w:val="000000"/>
+              <w:u w:val="none"/>
+            </w:rPr>
+          </w:pPr>
+          <w:hyperlink w:anchor="_rskttxo9w6es">
+            <w:r>
+              <w:rPr>
+                <w:rFonts w:ascii="Arial" w:cs="Arial" w:eastAsia="Arial" w:hAnsi="Arial"/>
+                <w:b w:val="0"/>
+                <w:i w:val="0"/>
+                <w:smallCaps w:val="0"/>
+                <w:strike w:val="0"/>
+                <w:color w:val="000000"/>
+                <w:sz w:val="22"/>
+                <w:szCs w:val="22"/>
+                <w:u w:val="none"/>
+                <w:shd w:fill="auto" w:val="clear"/>
+                <w:vertAlign w:val="baseline"/>
+                <w:rtl w:val="0"/>
+              </w:rPr>
+              <w:t xml:space="preserve">4.2 Backend en Supabase Cloud Functions</w:t>
+              <w:tab/>
+              <w:t xml:space="preserve">5</w:t>
+            </w:r>
+          </w:hyperlink>
+          <w:r>
+            <w:rPr>
+              <w:rtl w:val="0"/>
+            </w:rPr>
+          </w:r>
+        </w:p>
+        <w:p>
+          <w:pPr>
+            <w:widowControl w:val="0"/>
+            <w:tabs>
+              <w:tab w:val="right" w:leader="none" w:pos="12000"/>
+            </w:tabs>
+            <w:spacing w:before="60" w:line="240" w:lineRule="auto"/>
+            <w:ind w:left="360" w:firstLine="0"/>
+            <w:rPr>
+              <w:color w:val="000000"/>
+              <w:u w:val="none"/>
+            </w:rPr>
+          </w:pPr>
+          <w:hyperlink w:anchor="_pjan361wkaat">
+            <w:r>
+              <w:rPr>
+                <w:rFonts w:ascii="Arial" w:cs="Arial" w:eastAsia="Arial" w:hAnsi="Arial"/>
+                <w:b w:val="0"/>
+                <w:i w:val="0"/>
+                <w:smallCaps w:val="0"/>
+                <w:strike w:val="0"/>
+                <w:color w:val="000000"/>
+                <w:sz w:val="22"/>
+                <w:szCs w:val="22"/>
+                <w:u w:val="none"/>
+                <w:shd w:fill="auto" w:val="clear"/>
+                <w:vertAlign w:val="baseline"/>
+                <w:rtl w:val="0"/>
+              </w:rPr>
+              <w:t xml:space="preserve">4.3 Base de datos y autenticación</w:t>
+              <w:tab/>
+              <w:t xml:space="preserve">6</w:t>
+            </w:r>
+          </w:hyperlink>
+          <w:r>
+            <w:rPr>
+              <w:rtl w:val="0"/>
+            </w:rPr>
+          </w:r>
+        </w:p>
+        <w:p>
+          <w:pPr>
+            <w:widowControl w:val="0"/>
+            <w:tabs>
+              <w:tab w:val="right" w:leader="none" w:pos="12000"/>
+            </w:tabs>
+            <w:spacing w:before="60" w:line="240" w:lineRule="auto"/>
+            <w:ind w:left="360" w:firstLine="0"/>
+            <w:rPr>
+              <w:color w:val="000000"/>
+              <w:u w:val="none"/>
+            </w:rPr>
+          </w:pPr>
+          <w:hyperlink w:anchor="_indpq4po774w">
+            <w:r>
+              <w:rPr>
+                <w:rFonts w:ascii="Arial" w:cs="Arial" w:eastAsia="Arial" w:hAnsi="Arial"/>
+                <w:b w:val="0"/>
+                <w:i w:val="0"/>
+                <w:smallCaps w:val="0"/>
+                <w:strike w:val="0"/>
+                <w:color w:val="000000"/>
+                <w:sz w:val="22"/>
+                <w:szCs w:val="22"/>
+                <w:u w:val="none"/>
+                <w:shd w:fill="auto" w:val="clear"/>
+                <w:vertAlign w:val="baseline"/>
+                <w:rtl w:val="0"/>
+              </w:rPr>
+              <w:t xml:space="preserve">4.4 Frontend y experiencia de usuario</w:t>
+              <w:tab/>
+              <w:t xml:space="preserve">6</w:t>
+            </w:r>
+          </w:hyperlink>
+          <w:r>
+            <w:rPr>
+              <w:rtl w:val="0"/>
+            </w:rPr>
+          </w:r>
+        </w:p>
+        <w:p>
+          <w:pPr>
+            <w:widowControl w:val="0"/>
+            <w:tabs>
+              <w:tab w:val="right" w:leader="none" w:pos="12000"/>
+            </w:tabs>
+            <w:spacing w:before="60" w:line="240" w:lineRule="auto"/>
+            <w:ind w:left="360" w:firstLine="0"/>
+            <w:rPr>
+              <w:color w:val="000000"/>
+              <w:u w:val="none"/>
+            </w:rPr>
+          </w:pPr>
+          <w:hyperlink w:anchor="_p83o53ntjc9m">
+            <w:r>
+              <w:rPr>
+                <w:rFonts w:ascii="Arial" w:cs="Arial" w:eastAsia="Arial" w:hAnsi="Arial"/>
+                <w:b w:val="0"/>
+                <w:i w:val="0"/>
+                <w:smallCaps w:val="0"/>
+                <w:strike w:val="0"/>
+                <w:color w:val="000000"/>
+                <w:sz w:val="22"/>
+                <w:szCs w:val="22"/>
+                <w:u w:val="none"/>
+                <w:shd w:fill="auto" w:val="clear"/>
+                <w:vertAlign w:val="baseline"/>
+                <w:rtl w:val="0"/>
+              </w:rPr>
+              <w:t xml:space="preserve">4.5 Historias de usuario completadas y pendientes</w:t>
+              <w:tab/>
+              <w:t xml:space="preserve">6</w:t>
+            </w:r>
+          </w:hyperlink>
+          <w:r>
+            <w:rPr>
+              <w:rtl w:val="0"/>
+            </w:rPr>
+          </w:r>
+        </w:p>
+        <w:p>
+          <w:pPr>
+            <w:widowControl w:val="0"/>
+            <w:tabs>
+              <w:tab w:val="right" w:leader="none" w:pos="12000"/>
+            </w:tabs>
+            <w:spacing w:before="60" w:line="240" w:lineRule="auto"/>
+            <w:ind w:left="360" w:firstLine="0"/>
+            <w:rPr>
+              <w:color w:val="000000"/>
+              <w:u w:val="none"/>
+            </w:rPr>
+          </w:pPr>
+          <w:hyperlink w:anchor="_g6nr5vac9dnk">
+            <w:r>
+              <w:rPr>
+                <w:rFonts w:ascii="Arial" w:cs="Arial" w:eastAsia="Arial" w:hAnsi="Arial"/>
+                <w:b w:val="0"/>
+                <w:i w:val="0"/>
+                <w:smallCaps w:val="0"/>
+                <w:strike w:val="0"/>
+                <w:color w:val="000000"/>
+                <w:sz w:val="22"/>
+                <w:szCs w:val="22"/>
+                <w:u w:val="none"/>
+                <w:shd w:fill="auto" w:val="clear"/>
+                <w:vertAlign w:val="baseline"/>
+                <w:rtl w:val="0"/>
+              </w:rPr>
+              <w:t xml:space="preserve">4.6 Evidencias de avance&lt;- FALTA FALTA LFALTA FALTA FALTA</w:t>
+              <w:tab/>
+              <w:t xml:space="preserve">6</w:t>
+            </w:r>
+          </w:hyperlink>
+          <w:r>
+            <w:rPr>
+              <w:rtl w:val="0"/>
+            </w:rPr>
+          </w:r>
+        </w:p>
+        <w:p>
+          <w:pPr>
+            <w:widowControl w:val="0"/>
+            <w:tabs>
+              <w:tab w:val="right" w:leader="none" w:pos="12000"/>
+            </w:tabs>
+            <w:spacing w:before="60" w:line="240" w:lineRule="auto"/>
+            <w:rPr>
+              <w:b w:val="1"/>
+              <w:color w:val="000000"/>
+              <w:u w:val="none"/>
+            </w:rPr>
+          </w:pPr>
+          <w:hyperlink w:anchor="_ld2yur9l2ueb">
+            <w:r>
+              <w:rPr>
+                <w:rFonts w:ascii="Arial" w:cs="Arial" w:eastAsia="Arial" w:hAnsi="Arial"/>
+                <w:b w:val="0"/>
+                <w:i w:val="0"/>
+                <w:smallCaps w:val="0"/>
+                <w:strike w:val="0"/>
+                <w:color w:val="000000"/>
+                <w:sz w:val="22"/>
+                <w:szCs w:val="22"/>
+                <w:u w:val="none"/>
+                <w:shd w:fill="auto" w:val="clear"/>
+                <w:vertAlign w:val="baseline"/>
+                <w:rtl w:val="0"/>
+              </w:rPr>
+              <w:t xml:space="preserve">5. Conclusiones</w:t>
+              <w:tab/>
+              <w:t xml:space="preserve">6</w:t>
+            </w:r>
+          </w:hyperlink>
+          <w:r>
+            <w:rPr>
+              <w:rtl w:val="0"/>
+            </w:rPr>
+          </w:r>
+        </w:p>
+        <w:p>
+          <w:pPr>
+            <w:widowControl w:val="0"/>
+            <w:tabs>
+              <w:tab w:val="right" w:leader="none" w:pos="12000"/>
+            </w:tabs>
+            <w:spacing w:before="60" w:line="240" w:lineRule="auto"/>
+            <w:rPr>
+              <w:b w:val="1"/>
+              <w:color w:val="000000"/>
+              <w:u w:val="none"/>
+            </w:rPr>
+          </w:pPr>
+          <w:hyperlink w:anchor="_6e8zkcfd8p9k">
+            <w:r>
+              <w:rPr>
+                <w:rFonts w:ascii="Arial" w:cs="Arial" w:eastAsia="Arial" w:hAnsi="Arial"/>
+                <w:b w:val="0"/>
+                <w:i w:val="0"/>
+                <w:smallCaps w:val="0"/>
+                <w:strike w:val="0"/>
+                <w:color w:val="000000"/>
+                <w:sz w:val="22"/>
+                <w:szCs w:val="22"/>
+                <w:u w:val="none"/>
+                <w:shd w:fill="auto" w:val="clear"/>
+                <w:vertAlign w:val="baseline"/>
+                <w:rtl w:val="0"/>
+              </w:rPr>
+              <w:t xml:space="preserve">6. Reflexiones individuales</w:t>
+              <w:tab/>
+              <w:t xml:space="preserve">7</w:t>
+            </w:r>
+          </w:hyperlink>
+          <w:r>
+            <w:rPr>
+              <w:rtl w:val="0"/>
+            </w:rPr>
+          </w:r>
+          <w:r>
+            <w:fldChar w:fldCharType="end"/>
+          </w:r>
+        </w:p>
+      </w:sdtContent>
+    </w:sdt>
+    <w:p>
+      <w:pPr>
+        <w:spacing w:line="360" w:lineRule="auto"/>
+        <w:jc w:val="left"/>
+        <w:rPr>
+          <w:rFonts w:ascii="Calibri" w:cs="Calibri" w:eastAsia="Calibri" w:hAnsi="Calibri"/>
+          <w:sz w:val="24"/>
+          <w:szCs w:val="24"/>
+        </w:rPr>
+      </w:pPr>
+      <w:r>
+        <w:rPr>
+          <w:rtl w:val="0"/>
+        </w:rPr>
+      </w:r>
+    </w:p>
+    <w:p>
+      <w:pPr>
+        <w:spacing w:line="360" w:lineRule="auto"/>
+        <w:jc w:val="left"/>
+        <w:rPr>
+          <w:rFonts w:ascii="Calibri" w:cs="Calibri" w:eastAsia="Calibri" w:hAnsi="Calibri"/>
+          <w:sz w:val="24"/>
+          <w:szCs w:val="24"/>
+        </w:rPr>
+      </w:pPr>
+      <w:r>
+        <w:rPr>
+          <w:rtl w:val="0"/>
+        </w:rPr>
+      </w:r>
+    </w:p>
+    <w:p>
+      <w:pPr>
+        <w:spacing w:line="360" w:lineRule="auto"/>
+        <w:jc w:val="left"/>
+        <w:rPr>
+          <w:rFonts w:ascii="Calibri" w:cs="Calibri" w:eastAsia="Calibri" w:hAnsi="Calibri"/>
+          <w:sz w:val="24"/>
+          <w:szCs w:val="24"/>
+        </w:rPr>
+      </w:pPr>
+      <w:r>
+        <w:rPr>
+          <w:rtl w:val="0"/>
+        </w:rPr>
+      </w:r>
+    </w:p>
+    <w:p>
+      <w:pPr>
+        <w:spacing w:line="360" w:lineRule="auto"/>
+        <w:jc w:val="left"/>
+        <w:rPr>
+          <w:rFonts w:ascii="Calibri" w:cs="Calibri" w:eastAsia="Calibri" w:hAnsi="Calibri"/>
+          <w:sz w:val="24"/>
+          <w:szCs w:val="24"/>
+        </w:rPr>
+      </w:pPr>
+      <w:r>
+        <w:rPr>
+          <w:rtl w:val="0"/>
+        </w:rPr>
+      </w:r>
+    </w:p>
+    <w:p>
+      <w:pPr>
+        <w:spacing w:line="360" w:lineRule="auto"/>
+        <w:jc w:val="left"/>
+        <w:rPr>
+          <w:rFonts w:ascii="Calibri" w:cs="Calibri" w:eastAsia="Calibri" w:hAnsi="Calibri"/>
+          <w:sz w:val="24"/>
+          <w:szCs w:val="24"/>
+        </w:rPr>
+      </w:pPr>
+      <w:r>
+        <w:rPr>
+          <w:rtl w:val="0"/>
+        </w:rPr>
+      </w:r>
+    </w:p>
+    <w:p>
+      <w:pPr>
+        <w:spacing w:line="360" w:lineRule="auto"/>
+        <w:jc w:val="left"/>
+        <w:rPr>
+          <w:rFonts w:ascii="Calibri" w:cs="Calibri" w:eastAsia="Calibri" w:hAnsi="Calibri"/>
+          <w:sz w:val="24"/>
+          <w:szCs w:val="24"/>
+        </w:rPr>
+      </w:pPr>
+      <w:r>
+        <w:rPr>
+          <w:rtl w:val="0"/>
+        </w:rPr>
+      </w:r>
+    </w:p>
+    <w:p>
+      <w:pPr>
+        <w:spacing w:line="360" w:lineRule="auto"/>
+        <w:jc w:val="left"/>
+        <w:rPr>
+          <w:rFonts w:ascii="Calibri" w:cs="Calibri" w:eastAsia="Calibri" w:hAnsi="Calibri"/>
+          <w:sz w:val="24"/>
+          <w:szCs w:val="24"/>
+        </w:rPr>
+      </w:pPr>
+      <w:r>
+        <w:rPr>
+          <w:rtl w:val="0"/>
+        </w:rPr>
+      </w:r>
+    </w:p>
+    <w:p>
+      <w:pPr>
+        <w:spacing w:line="360" w:lineRule="auto"/>
+        <w:jc w:val="left"/>
+        <w:rPr>
+          <w:rFonts w:ascii="Calibri" w:cs="Calibri" w:eastAsia="Calibri" w:hAnsi="Calibri"/>
+          <w:sz w:val="24"/>
+          <w:szCs w:val="24"/>
+        </w:rPr>
+      </w:pPr>
+      <w:r>
+        <w:rPr>
+          <w:rtl w:val="0"/>
+        </w:rPr>
+      </w:r>
+    </w:p>
+    <w:p>
+      <w:pPr>
+        <w:spacing w:line="360" w:lineRule="auto"/>
+        <w:jc w:val="right"/>
+        <w:rPr>
+          <w:rFonts w:ascii="Calibri" w:cs="Calibri" w:eastAsia="Calibri" w:hAnsi="Calibri"/>
+          <w:sz w:val="24"/>
+          <w:szCs w:val="24"/>
+        </w:rPr>
+      </w:pPr>
+      <w:r>
+        <w:rPr>
+          <w:rtl w:val="0"/>
+        </w:rPr>
+      </w:r>
+    </w:p>
+    <w:p>
+      <w:pPr>
         <w:pStyle w:val="Heading2"/>
         <w:keepNext w:val="0"/>
         <w:keepLines w:val="0"/>
@@ -14,13 +1558,31 @@
           <w:szCs w:val="34"/>
         </w:rPr>
       </w:pPr>
-      <w:bookmarkStart w:colFirst="0" w:colLast="0" w:name="_36d6ofware0r" w:id="0"/>
-      <w:bookmarkEnd w:id="0"/>
-      <w:r>
-        <w:rPr>
-          <w:b w:val="1"/>
-          <w:sz w:val="34"/>
-          <w:szCs w:val="34"/>
+      <w:bookmarkStart w:colFirst="0" w:colLast="0" w:name="_gdb9mf6dv7h5" w:id="3"/>
+      <w:bookmarkEnd w:id="3"/>
+      <w:r>
+        <w:rPr>
+          <w:rtl w:val="0"/>
+        </w:rPr>
+      </w:r>
+    </w:p>
+    <w:p>
+      <w:pPr>
+        <w:pStyle w:val="Heading3"/>
+        <w:keepNext w:val="0"/>
+        <w:keepLines w:val="0"/>
+        <w:numPr>
+          <w:ilvl w:val="0"/>
+          <w:numId w:val="5"/>
+        </w:numPr>
+        <w:spacing w:after="80" w:lineRule="auto"/>
+        <w:ind w:left="720" w:hanging="360"/>
+        <w:rPr/>
+      </w:pPr>
+      <w:bookmarkStart w:colFirst="0" w:colLast="0" w:name="_36d6ofware0r" w:id="4"/>
+      <w:bookmarkEnd w:id="4"/>
+      <w:r>
+        <w:rPr>
           <w:rtl w:val="0"/>
         </w:rPr>
         <w:t xml:space="preserve">Abstract</w:t>
@@ -35,63 +1597,11 @@
         <w:rPr>
           <w:rtl w:val="0"/>
         </w:rPr>
-        <w:t xml:space="preserve">El presente informe expone los avances realizados en el proyecto </w:t>
-      </w:r>
-      <w:r>
-        <w:rPr>
-          <w:b w:val="1"/>
-          <w:rtl w:val="0"/>
-        </w:rPr>
-        <w:t xml:space="preserve">APT</w:t>
-      </w:r>
-      <w:r>
-        <w:rPr>
-          <w:rtl w:val="0"/>
-        </w:rPr>
-        <w:t xml:space="preserve">, aplicación móvil orientada al control de gastos personales mediante una interfaz intuitiva, reconocimiento automático de boletas y recomendaciones financieras personalizadas.</w:t>
+        <w:t xml:space="preserve">El presente informe expone los avances realizados en el proyecto APT, aplicación móvil orientada al control de gastos personales mediante una interfaz intuitiva, reconocimiento automático de boletas y recomendaciones financieras personalizadas.</w:t>
         <w:br w:type="textWrapping"/>
-        <w:t xml:space="preserve"> Durante esta etapa del proyecto, se alcanzó un </w:t>
-      </w:r>
-      <w:r>
-        <w:rPr>
-          <w:b w:val="1"/>
-          <w:rtl w:val="0"/>
-        </w:rPr>
-        <w:t xml:space="preserve">57% de avance funcional (18 de 30 Historias de Usuario completadas)</w:t>
-      </w:r>
-      <w:r>
-        <w:rPr>
-          <w:rtl w:val="0"/>
-        </w:rPr>
-        <w:t xml:space="preserve">, consolidando los módulos principales de autenticación, gestión de gastos, presupuestos, metas y visualización gráfica.</w:t>
+        <w:t xml:space="preserve"> Durante esta etapa del proyecto, se alcanzó un 57% de avance funcional (18 de 30 Historias de Usuario completadas), consolidando los módulos principales de autenticación, gestión de gastos, presupuestos, metas y visualización gráfica.</w:t>
         <w:br w:type="textWrapping"/>
-        <w:t xml:space="preserve"> El equipo ha implementado una </w:t>
-      </w:r>
-      <w:r>
-        <w:rPr>
-          <w:b w:val="1"/>
-          <w:rtl w:val="0"/>
-        </w:rPr>
-        <w:t xml:space="preserve">arquitectura serverless</w:t>
-      </w:r>
-      <w:r>
-        <w:rPr>
-          <w:rtl w:val="0"/>
-        </w:rPr>
-        <w:t xml:space="preserve"> basada en </w:t>
-      </w:r>
-      <w:r>
-        <w:rPr>
-          <w:b w:val="1"/>
-          <w:rtl w:val="0"/>
-        </w:rPr>
-        <w:t xml:space="preserve">React Native y Supabase</w:t>
-      </w:r>
-      <w:r>
-        <w:rPr>
-          <w:rtl w:val="0"/>
-        </w:rPr>
-        <w:t xml:space="preserve">, permitiendo un desarrollo ágil, escalable y de bajo mantenimiento. Se presentan los ajustes metodológicos realizados, las evidencias del progreso alcanzado y las reflexiones sobre los desafíos encontrados.</w:t>
+        <w:t xml:space="preserve"> El equipo ha implementado una arquitectura serverless basada en React Native y Supabase, permitiendo un desarrollo ágil, escalable y de bajo mantenimiento. Se presentan los ajustes metodológicos realizados, las evidencias del progreso alcanzado y las reflexiones sobre los desafíos encontrados.</w:t>
       </w:r>
     </w:p>
     <w:p>
@@ -130,8 +1640,8 @@
           <w:szCs w:val="26"/>
         </w:rPr>
       </w:pPr>
-      <w:bookmarkStart w:colFirst="0" w:colLast="0" w:name="_ay9ryuwdvotd" w:id="1"/>
-      <w:bookmarkEnd w:id="1"/>
+      <w:bookmarkStart w:colFirst="0" w:colLast="0" w:name="_ay9ryuwdvotd" w:id="5"/>
+      <w:bookmarkEnd w:id="5"/>
       <w:r>
         <w:rPr>
           <w:b w:val="1"/>
@@ -157,8 +1667,8 @@
           <w:szCs w:val="22"/>
         </w:rPr>
       </w:pPr>
-      <w:bookmarkStart w:colFirst="0" w:colLast="0" w:name="_ov8xdlwhbxw" w:id="2"/>
-      <w:bookmarkEnd w:id="2"/>
+      <w:bookmarkStart w:colFirst="0" w:colLast="0" w:name="_ov8xdlwhbxw" w:id="6"/>
+      <w:bookmarkEnd w:id="6"/>
       <w:r>
         <w:rPr>
           <w:b w:val="1"/>
@@ -181,7 +1691,7 @@
         </w:rPr>
         <w:t xml:space="preserve">Durante el desarrollo del proyecto se enfrentaron diversas dificultades técnicas y organizacionales. En primer lugar, se presentaron desafíos en la conexión inicial entre el frontend y el backend en Supabase, especialmente al manejar la lógica dentro de Cloud Functions y los permisos mediante políticas RLS (Row Level Security).</w:t>
         <w:br w:type="textWrapping"/>
-        <w:t xml:space="preserve"> Además, la definición de prioridades dentro de las historias de usuario exigió un ajuste de alcance para asegurar la finalización dentro del plazo del taller. También fue necesario redefinir la estructura del repositorio para facilitar la colaboración y el control de versiones.</w:t>
+        <w:t xml:space="preserve">Además, la definición de prioridades dentro de las historias de usuario exigió un ajuste de alcance para asegurar la finalización dentro del plazo del taller. También fue necesario redefinir la estructura del repositorio para facilitar la colaboración y el control de versiones.</w:t>
       </w:r>
     </w:p>
     <w:p>
@@ -198,8 +1708,8 @@
           <w:szCs w:val="22"/>
         </w:rPr>
       </w:pPr>
-      <w:bookmarkStart w:colFirst="0" w:colLast="0" w:name="_z1el72tvqm2k" w:id="3"/>
-      <w:bookmarkEnd w:id="3"/>
+      <w:bookmarkStart w:colFirst="0" w:colLast="0" w:name="_z1el72tvqm2k" w:id="7"/>
+      <w:bookmarkEnd w:id="7"/>
       <w:r>
         <w:rPr>
           <w:b w:val="1"/>
@@ -222,7 +1732,7 @@
         </w:rPr>
         <w:t xml:space="preserve">Entre los aspectos que facilitaron el avance destacan la documentación clara proporcionada por Supabase, la comunicación fluida entre los integrantes del equipo y el apoyo docente recibido en las instancias de retroalimentación.</w:t>
         <w:br w:type="textWrapping"/>
-        <w:t xml:space="preserve"> El uso de GitHub para la gestión del proyecto permitió mantener una trazabilidad clara del progreso y las versiones de código, mientras que las reuniones semanales sirvieron para coordinar avances y resolver bloqueos.</w:t>
+        <w:t xml:space="preserve">El uso de GitHub para la gestión del proyecto permitió mantener una trazabilidad clara del progreso y las versiones de código, mientras que las reuniones semanales sirvieron para coordinar avances y resolver bloqueos.</w:t>
       </w:r>
     </w:p>
     <w:p>
@@ -239,8 +1749,8 @@
           <w:szCs w:val="22"/>
         </w:rPr>
       </w:pPr>
-      <w:bookmarkStart w:colFirst="0" w:colLast="0" w:name="_tlaro3xgidfo" w:id="4"/>
-      <w:bookmarkEnd w:id="4"/>
+      <w:bookmarkStart w:colFirst="0" w:colLast="0" w:name="_tlaro3xgidfo" w:id="8"/>
+      <w:bookmarkEnd w:id="8"/>
       <w:r>
         <w:rPr>
           <w:b w:val="1"/>
@@ -263,20 +1773,7 @@
         </w:rPr>
         <w:t xml:space="preserve">Durante las sesiones de revisión, se sugirió delimitar el alcance funcional del proyecto para asegurar una entrega completa y operativa dentro del plazo establecido.</w:t>
         <w:br w:type="textWrapping"/>
-        <w:t xml:space="preserve"> Asimismo, se recomendó priorizar las funcionalidades de mayor valor para el usuario final, como el acceso a exámenes, autenticación y manejo de sesiones. Gracias a esta retroalimentación, el equipo decidió establecer un </w:t>
-      </w:r>
-      <w:r>
-        <w:rPr>
-          <w:b w:val="1"/>
-          <w:rtl w:val="0"/>
-        </w:rPr>
-        <w:t xml:space="preserve">límite de 30 historias de usuario</w:t>
-      </w:r>
-      <w:r>
-        <w:rPr>
-          <w:rtl w:val="0"/>
-        </w:rPr>
-        <w:t xml:space="preserve">, abarcando las funcionalidades esenciales para la operación del sistema.</w:t>
+        <w:t xml:space="preserve"> Asimismo, se recomendó priorizar las funcionalidades de mayor valor para el usuario final, como el acceso a exámenes, autenticación y manejo de sesiones. Gracias a esta retroalimentación, el equipo decidió establecer un límite de 30 historias de usuario, abarcando las funcionalidades esenciales para la operación del sistema.</w:t>
       </w:r>
     </w:p>
     <w:p>
@@ -293,8 +1790,8 @@
           <w:szCs w:val="22"/>
         </w:rPr>
       </w:pPr>
-      <w:bookmarkStart w:colFirst="0" w:colLast="0" w:name="_o8gxho8xwpb4" w:id="5"/>
-      <w:bookmarkEnd w:id="5"/>
+      <w:bookmarkStart w:colFirst="0" w:colLast="0" w:name="_o8gxho8xwpb4" w:id="9"/>
+      <w:bookmarkEnd w:id="9"/>
       <w:r>
         <w:rPr>
           <w:b w:val="1"/>
@@ -326,25 +1823,13 @@
         </w:numPr>
         <w:spacing w:after="0" w:afterAutospacing="0" w:before="240" w:lineRule="auto"/>
         <w:ind w:left="720" w:hanging="360"/>
-      </w:pPr>
-      <w:r>
-        <w:rPr>
-          <w:rtl w:val="0"/>
-        </w:rPr>
-        <w:t xml:space="preserve">Se estableció el </w:t>
-      </w:r>
-      <w:r>
-        <w:rPr>
-          <w:b w:val="1"/>
-          <w:rtl w:val="0"/>
-        </w:rPr>
-        <w:t xml:space="preserve">alcance máximo de 30 historias de usuario</w:t>
-      </w:r>
-      <w:r>
-        <w:rPr>
-          <w:rtl w:val="0"/>
-        </w:rPr>
-        <w:t xml:space="preserve"> como meta del taller.</w:t>
+        <w:rPr/>
+      </w:pPr>
+      <w:r>
+        <w:rPr>
+          <w:rtl w:val="0"/>
+        </w:rPr>
+        <w:t xml:space="preserve">Se estableció el alcance máximo de 30 historias de usuario como meta de asignatura.</w:t>
         <w:br w:type="textWrapping"/>
       </w:r>
     </w:p>
@@ -356,25 +1841,13 @@
         </w:numPr>
         <w:spacing w:after="0" w:afterAutospacing="0" w:before="0" w:beforeAutospacing="0" w:lineRule="auto"/>
         <w:ind w:left="720" w:hanging="360"/>
-      </w:pPr>
-      <w:r>
-        <w:rPr>
-          <w:rtl w:val="0"/>
-        </w:rPr>
-        <w:t xml:space="preserve">Se migró la lógica del backend a </w:t>
-      </w:r>
-      <w:r>
-        <w:rPr>
-          <w:b w:val="1"/>
-          <w:rtl w:val="0"/>
-        </w:rPr>
-        <w:t xml:space="preserve">Supabase Cloud Functions</w:t>
-      </w:r>
-      <w:r>
-        <w:rPr>
-          <w:rtl w:val="0"/>
-        </w:rPr>
-        <w:t xml:space="preserve">, eliminando la necesidad de un servidor dedicado.</w:t>
+        <w:rPr/>
+      </w:pPr>
+      <w:r>
+        <w:rPr>
+          <w:rtl w:val="0"/>
+        </w:rPr>
+        <w:t xml:space="preserve">Se migró la lógica del backend a Supabase Cloud Functions, eliminando la necesidad de un servidor dedicado.</w:t>
         <w:br w:type="textWrapping"/>
       </w:r>
     </w:p>
@@ -386,25 +1859,13 @@
         </w:numPr>
         <w:spacing w:after="0" w:afterAutospacing="0" w:before="0" w:beforeAutospacing="0" w:lineRule="auto"/>
         <w:ind w:left="720" w:hanging="360"/>
-      </w:pPr>
-      <w:r>
-        <w:rPr>
-          <w:rtl w:val="0"/>
-        </w:rPr>
-        <w:t xml:space="preserve">Se reforzó la </w:t>
-      </w:r>
-      <w:r>
-        <w:rPr>
-          <w:b w:val="1"/>
-          <w:rtl w:val="0"/>
-        </w:rPr>
-        <w:t xml:space="preserve">seguridad y manejo de permisos</w:t>
-      </w:r>
-      <w:r>
-        <w:rPr>
-          <w:rtl w:val="0"/>
-        </w:rPr>
-        <w:t xml:space="preserve"> mediante políticas RLS en Supabase.</w:t>
+        <w:rPr/>
+      </w:pPr>
+      <w:r>
+        <w:rPr>
+          <w:rtl w:val="0"/>
+        </w:rPr>
+        <w:t xml:space="preserve">Se reforzó la seguridad y manejo de permisos mediante políticas RLS en Supabase.</w:t>
         <w:br w:type="textWrapping"/>
       </w:r>
     </w:p>
@@ -416,6 +1877,7 @@
         </w:numPr>
         <w:spacing w:after="240" w:before="0" w:beforeAutospacing="0" w:lineRule="auto"/>
         <w:ind w:left="720" w:hanging="360"/>
+        <w:rPr/>
       </w:pPr>
       <w:r>
         <w:rPr>
@@ -493,8 +1955,8 @@
           <w:szCs w:val="26"/>
         </w:rPr>
       </w:pPr>
-      <w:bookmarkStart w:colFirst="0" w:colLast="0" w:name="_ye8n622i17fi" w:id="6"/>
-      <w:bookmarkEnd w:id="6"/>
+      <w:bookmarkStart w:colFirst="0" w:colLast="0" w:name="_ye8n622i17fi" w:id="10"/>
+      <w:bookmarkEnd w:id="10"/>
       <w:r>
         <w:rPr>
           <w:b w:val="1"/>
@@ -520,8 +1982,8 @@
           <w:szCs w:val="22"/>
         </w:rPr>
       </w:pPr>
-      <w:bookmarkStart w:colFirst="0" w:colLast="0" w:name="_8hzusig2h8bh" w:id="7"/>
-      <w:bookmarkEnd w:id="7"/>
+      <w:bookmarkStart w:colFirst="0" w:colLast="0" w:name="_8hzusig2h8bh" w:id="11"/>
+      <w:bookmarkEnd w:id="11"/>
       <w:r>
         <w:rPr>
           <w:b w:val="1"/>
@@ -542,20 +2004,7 @@
         <w:rPr>
           <w:rtl w:val="0"/>
         </w:rPr>
-        <w:t xml:space="preserve">El proyecto se desarrolló bajo una </w:t>
-      </w:r>
-      <w:r>
-        <w:rPr>
-          <w:b w:val="1"/>
-          <w:rtl w:val="0"/>
-        </w:rPr>
-        <w:t xml:space="preserve">metodología ágil de tipo Scrum</w:t>
-      </w:r>
-      <w:r>
-        <w:rPr>
-          <w:rtl w:val="0"/>
-        </w:rPr>
-        <w:t xml:space="preserve">, adaptada al contexto académico. El equipo trabajó en iteraciones cortas (sprints), realizando reuniones de seguimiento semanales y revisiones al cierre de cada ciclo. Esto permitió planificar entregas parciales, evaluar el avance y ajustar prioridades según el progreso.</w:t>
+        <w:t xml:space="preserve">El proyecto se desarrolló bajo una metodología ágil de tipo Scrum, adaptada al contexto académico. El equipo trabajó en iteraciones cortas (sprints), realizando reuniones de seguimiento semanales y revisiones al cierre de cada ciclo. Esto permitió planificar entregas parciales, evaluar el avance y ajustar prioridades según el progreso.</w:t>
       </w:r>
     </w:p>
     <w:p>
@@ -572,8 +2021,8 @@
           <w:szCs w:val="22"/>
         </w:rPr>
       </w:pPr>
-      <w:bookmarkStart w:colFirst="0" w:colLast="0" w:name="_8qvoayf7llyj" w:id="8"/>
-      <w:bookmarkEnd w:id="8"/>
+      <w:bookmarkStart w:colFirst="0" w:colLast="0" w:name="_8qvoayf7llyj" w:id="12"/>
+      <w:bookmarkEnd w:id="12"/>
       <w:r>
         <w:rPr>
           <w:b w:val="1"/>
@@ -696,8 +2145,8 @@
           <w:szCs w:val="22"/>
         </w:rPr>
       </w:pPr>
-      <w:bookmarkStart w:colFirst="0" w:colLast="0" w:name="_abzq03kxp1n1" w:id="9"/>
-      <w:bookmarkEnd w:id="9"/>
+      <w:bookmarkStart w:colFirst="0" w:colLast="0" w:name="_abzq03kxp1n1" w:id="13"/>
+      <w:bookmarkEnd w:id="13"/>
       <w:r>
         <w:rPr>
           <w:b w:val="1"/>
@@ -765,7 +2214,12 @@
         <w:rPr>
           <w:rtl w:val="0"/>
         </w:rPr>
-        <w:t xml:space="preserve"> Desarrollo del frontend, diseño de interfaz y documentación técnica.</w:t>
+        <w:t xml:space="preserve">  Desarrollo del frontend, diseño de interfaz y documentación técnica. </w:t>
+      </w:r>
+      <w:r>
+        <w:rPr>
+          <w:rtl w:val="0"/>
+        </w:rPr>
         <w:br w:type="textWrapping"/>
       </w:r>
     </w:p>
@@ -789,7 +2243,20 @@
         <w:rPr>
           <w:rtl w:val="0"/>
         </w:rPr>
-        <w:t xml:space="preserve"> Integración de base de datos, autenticación y apoyo en documentación.</w:t>
+        <w:t xml:space="preserve">.</w:t>
+      </w:r>
+      <w:r>
+        <w:rPr>
+          <w:b w:val="1"/>
+          <w:rtl w:val="0"/>
+        </w:rPr>
+        <w:t xml:space="preserve"> </w:t>
+      </w:r>
+      <w:r>
+        <w:rPr>
+          <w:rtl w:val="0"/>
+        </w:rPr>
+        <w:t xml:space="preserve">Integración de base de datos, autenticación y apoyo en desarrollo global.</w:t>
       </w:r>
     </w:p>
     <w:p>
@@ -817,8 +2284,8 @@
           <w:szCs w:val="26"/>
         </w:rPr>
       </w:pPr>
-      <w:bookmarkStart w:colFirst="0" w:colLast="0" w:name="_9tib86b2us3" w:id="10"/>
-      <w:bookmarkEnd w:id="10"/>
+      <w:bookmarkStart w:colFirst="0" w:colLast="0" w:name="_9tib86b2us3" w:id="14"/>
+      <w:bookmarkEnd w:id="14"/>
       <w:r>
         <w:rPr>
           <w:b w:val="1"/>
@@ -839,20 +2306,7 @@
         <w:rPr>
           <w:rtl w:val="0"/>
         </w:rPr>
-        <w:t xml:space="preserve">La metodología seleccionada garantiza coherencia con los objetivos de la carrera y los requerimientos de ingeniería, ya que fomenta la </w:t>
-      </w:r>
-      <w:r>
-        <w:rPr>
-          <w:b w:val="1"/>
-          <w:rtl w:val="0"/>
-        </w:rPr>
-        <w:t xml:space="preserve">planificación estructurada, la documentación técnica y la validación progresiva de funcionalidades</w:t>
-      </w:r>
-      <w:r>
-        <w:rPr>
-          <w:rtl w:val="0"/>
-        </w:rPr>
-        <w:t xml:space="preserve">.</w:t>
+        <w:t xml:space="preserve">La metodología seleccionada garantiza coherencia con los objetivos de la carrera y los requerimientos de ingeniería, ya que fomenta la planificación estructurada, la documentación técnica y la validación progresiva de funcionalidades.</w:t>
       </w:r>
     </w:p>
     <w:p>
@@ -891,8 +2345,8 @@
           <w:szCs w:val="26"/>
         </w:rPr>
       </w:pPr>
-      <w:bookmarkStart w:colFirst="0" w:colLast="0" w:name="_o699bo9n5qvg" w:id="11"/>
-      <w:bookmarkEnd w:id="11"/>
+      <w:bookmarkStart w:colFirst="0" w:colLast="0" w:name="_o699bo9n5qvg" w:id="15"/>
+      <w:bookmarkEnd w:id="15"/>
       <w:r>
         <w:rPr>
           <w:b w:val="1"/>
@@ -917,8 +2371,8 @@
           <w:szCs w:val="22"/>
         </w:rPr>
       </w:pPr>
-      <w:bookmarkStart w:colFirst="0" w:colLast="0" w:name="_ltnys5hpqnsq" w:id="12"/>
-      <w:bookmarkEnd w:id="12"/>
+      <w:bookmarkStart w:colFirst="0" w:colLast="0" w:name="_ltnys5hpqnsq" w:id="16"/>
+      <w:bookmarkEnd w:id="16"/>
       <w:r>
         <w:rPr>
           <w:b w:val="1"/>
@@ -977,7 +2431,7 @@
         <w:rPr>
           <w:rtl w:val="0"/>
         </w:rPr>
-        <w:t xml:space="preserve"> React con componentes modulares.</w:t>
+        <w:t xml:space="preserve"> React Native con componentes modulares.</w:t>
         <w:br w:type="textWrapping"/>
       </w:r>
     </w:p>
@@ -1001,7 +2455,7 @@
         <w:rPr>
           <w:rtl w:val="0"/>
         </w:rPr>
-        <w:t xml:space="preserve"> Supabase Cloud Functions.</w:t>
+        <w:t xml:space="preserve"> Supabase Edge Functions.</w:t>
         <w:br w:type="textWrapping"/>
       </w:r>
     </w:p>
@@ -1049,7 +2503,7 @@
         <w:rPr>
           <w:rtl w:val="0"/>
         </w:rPr>
-        <w:t xml:space="preserve"> Supabase Storage (para resultados y archivos).</w:t>
+        <w:t xml:space="preserve"> Supabase Storage (archivos).</w:t>
         <w:br w:type="textWrapping"/>
       </w:r>
     </w:p>
@@ -1090,8 +2544,8 @@
           <w:szCs w:val="22"/>
         </w:rPr>
       </w:pPr>
-      <w:bookmarkStart w:colFirst="0" w:colLast="0" w:name="_rskttxo9w6es" w:id="13"/>
-      <w:bookmarkEnd w:id="13"/>
+      <w:bookmarkStart w:colFirst="0" w:colLast="0" w:name="_rskttxo9w6es" w:id="17"/>
+      <w:bookmarkEnd w:id="17"/>
       <w:r>
         <w:rPr>
           <w:b w:val="1"/>
@@ -1119,7 +2573,7 @@
       <w:pPr>
         <w:numPr>
           <w:ilvl w:val="0"/>
-          <w:numId w:val="5"/>
+          <w:numId w:val="6"/>
         </w:numPr>
         <w:spacing w:after="0" w:afterAutospacing="0" w:before="240" w:lineRule="auto"/>
         <w:ind w:left="720" w:hanging="360"/>
@@ -1136,7 +2590,7 @@
       <w:pPr>
         <w:numPr>
           <w:ilvl w:val="0"/>
-          <w:numId w:val="5"/>
+          <w:numId w:val="6"/>
         </w:numPr>
         <w:spacing w:after="0" w:afterAutospacing="0" w:before="0" w:beforeAutospacing="0" w:lineRule="auto"/>
         <w:ind w:left="720" w:hanging="360"/>
@@ -1145,7 +2599,7 @@
         <w:rPr>
           <w:rtl w:val="0"/>
         </w:rPr>
-        <w:t xml:space="preserve">Consulta y retorno de resultados médicos.</w:t>
+        <w:t xml:space="preserve">Registro de boletas de manera manual y OCR.</w:t>
         <w:br w:type="textWrapping"/>
       </w:r>
     </w:p>
@@ -1153,7 +2607,7 @@
       <w:pPr>
         <w:numPr>
           <w:ilvl w:val="0"/>
-          <w:numId w:val="5"/>
+          <w:numId w:val="6"/>
         </w:numPr>
         <w:spacing w:after="240" w:before="0" w:beforeAutospacing="0" w:lineRule="auto"/>
         <w:ind w:left="720" w:hanging="360"/>
@@ -1179,8 +2633,8 @@
           <w:szCs w:val="22"/>
         </w:rPr>
       </w:pPr>
-      <w:bookmarkStart w:colFirst="0" w:colLast="0" w:name="_pjan361wkaat" w:id="14"/>
-      <w:bookmarkEnd w:id="14"/>
+      <w:bookmarkStart w:colFirst="0" w:colLast="0" w:name="_pjan361wkaat" w:id="18"/>
+      <w:bookmarkEnd w:id="18"/>
       <w:r>
         <w:rPr>
           <w:b w:val="1"/>
@@ -1217,8 +2671,8 @@
           <w:szCs w:val="22"/>
         </w:rPr>
       </w:pPr>
-      <w:bookmarkStart w:colFirst="0" w:colLast="0" w:name="_indpq4po774w" w:id="15"/>
-      <w:bookmarkEnd w:id="15"/>
+      <w:bookmarkStart w:colFirst="0" w:colLast="0" w:name="_indpq4po774w" w:id="19"/>
+      <w:bookmarkEnd w:id="19"/>
       <w:r>
         <w:rPr>
           <w:b w:val="1"/>
@@ -1239,20 +2693,51 @@
         <w:rPr>
           <w:rtl w:val="0"/>
         </w:rPr>
-        <w:t xml:space="preserve">El frontend fue desarrollado en </w:t>
-      </w:r>
-      <w:r>
-        <w:rPr>
-          <w:b w:val="1"/>
-          <w:rtl w:val="0"/>
-        </w:rPr>
-        <w:t xml:space="preserve">React</w:t>
-      </w:r>
-      <w:r>
-        <w:rPr>
-          <w:rtl w:val="0"/>
-        </w:rPr>
-        <w:t xml:space="preserve">, priorizando la usabilidad y la adaptabilidad visual. Se implementaron vistas principales como:</w:t>
+        <w:t xml:space="preserve">El frontend fue desarrollado en React Native, priorizando la usabilidad y la adaptabilidad visual. Para diseño ocupamos Nativewind.</w:t>
+      </w:r>
+      <w:r>
+        <w:rPr>
+          <w:rtl w:val="0"/>
+        </w:rPr>
+        <w:br w:type="textWrapping"/>
+      </w:r>
+    </w:p>
+    <w:p>
+      <w:pPr>
+        <w:pStyle w:val="Heading4"/>
+        <w:keepNext w:val="0"/>
+        <w:keepLines w:val="0"/>
+        <w:spacing w:after="40" w:before="240" w:lineRule="auto"/>
+        <w:rPr>
+          <w:b w:val="1"/>
+          <w:color w:val="000000"/>
+          <w:sz w:val="22"/>
+          <w:szCs w:val="22"/>
+        </w:rPr>
+      </w:pPr>
+      <w:bookmarkStart w:colFirst="0" w:colLast="0" w:name="_p83o53ntjc9m" w:id="20"/>
+      <w:bookmarkEnd w:id="20"/>
+      <w:r>
+        <w:rPr>
+          <w:b w:val="1"/>
+          <w:color w:val="000000"/>
+          <w:sz w:val="22"/>
+          <w:szCs w:val="22"/>
+          <w:rtl w:val="0"/>
+        </w:rPr>
+        <w:t xml:space="preserve">4.5 Historias de usuario completadas y pendientes</w:t>
+      </w:r>
+    </w:p>
+    <w:p>
+      <w:pPr>
+        <w:spacing w:after="240" w:before="240" w:lineRule="auto"/>
+        <w:rPr/>
+      </w:pPr>
+      <w:r>
+        <w:rPr>
+          <w:rtl w:val="0"/>
+        </w:rPr>
+        <w:t xml:space="preserve">El proyecto contempla 30 historias de usuario como alcance definido.</w:t>
       </w:r>
     </w:p>
     <w:p>
@@ -1266,26 +2751,16 @@
       </w:pPr>
       <w:r>
         <w:rPr>
-          <w:rtl w:val="0"/>
-        </w:rPr>
-        <w:t xml:space="preserve">Inicio de sesión y registro.</w:t>
-        <w:br w:type="textWrapping"/>
-      </w:r>
-    </w:p>
-    <w:p>
-      <w:pPr>
-        <w:numPr>
-          <w:ilvl w:val="0"/>
-          <w:numId w:val="7"/>
-        </w:numPr>
-        <w:spacing w:after="0" w:afterAutospacing="0" w:before="0" w:beforeAutospacing="0" w:lineRule="auto"/>
-        <w:ind w:left="720" w:hanging="360"/>
-      </w:pPr>
-      <w:r>
-        <w:rPr>
-          <w:rtl w:val="0"/>
-        </w:rPr>
-        <w:t xml:space="preserve">Panel del paciente.</w:t>
+          <w:b w:val="1"/>
+          <w:rtl w:val="0"/>
+        </w:rPr>
+        <w:t xml:space="preserve">Historias completadas (marcadas en verde):</w:t>
+      </w:r>
+      <w:r>
+        <w:rPr>
+          <w:rtl w:val="0"/>
+        </w:rPr>
+        <w:t xml:space="preserve"> funcionalidades esenciales como login, registro, ocr, ingresos, metas.</w:t>
         <w:br w:type="textWrapping"/>
       </w:r>
     </w:p>
@@ -1300,10 +2775,16 @@
       </w:pPr>
       <w:r>
         <w:rPr>
-          <w:rtl w:val="0"/>
-        </w:rPr>
-        <w:t xml:space="preserve">Vista de resultados de exámenes.</w:t>
-        <w:br w:type="textWrapping"/>
+          <w:b w:val="1"/>
+          <w:rtl w:val="0"/>
+        </w:rPr>
+        <w:t xml:space="preserve">Historias pendientes (marcadas en amarillo):</w:t>
+      </w:r>
+      <w:r>
+        <w:rPr>
+          <w:rtl w:val="0"/>
+        </w:rPr>
+        <w:t xml:space="preserve"> tips con inteligencia artificial, calculos, analisis. </w:t>
       </w:r>
     </w:p>
     <w:p>
@@ -1319,8 +2800,8 @@
           <w:szCs w:val="22"/>
         </w:rPr>
       </w:pPr>
-      <w:bookmarkStart w:colFirst="0" w:colLast="0" w:name="_p83o53ntjc9m" w:id="16"/>
-      <w:bookmarkEnd w:id="16"/>
+      <w:bookmarkStart w:colFirst="0" w:colLast="0" w:name="_g6nr5vac9dnk" w:id="21"/>
+      <w:bookmarkEnd w:id="21"/>
       <w:r>
         <w:rPr>
           <w:b w:val="1"/>
@@ -1329,122 +2810,134 @@
           <w:szCs w:val="22"/>
           <w:rtl w:val="0"/>
         </w:rPr>
-        <w:t xml:space="preserve">4.5 Historias de usuario completadas y pendientes</w:t>
-      </w:r>
-    </w:p>
-    <w:p>
-      <w:pPr>
-        <w:spacing w:after="240" w:before="240" w:lineRule="auto"/>
-        <w:rPr/>
-      </w:pPr>
-      <w:r>
-        <w:rPr>
-          <w:rtl w:val="0"/>
-        </w:rPr>
-        <w:t xml:space="preserve">El proyecto contempla </w:t>
-      </w:r>
-      <w:r>
-        <w:rPr>
-          <w:b w:val="1"/>
-          <w:rtl w:val="0"/>
-        </w:rPr>
-        <w:t xml:space="preserve">30 historias de usuario</w:t>
-      </w:r>
-      <w:r>
-        <w:rPr>
-          <w:rtl w:val="0"/>
-        </w:rPr>
-        <w:t xml:space="preserve"> como alcance definido.</w:t>
-      </w:r>
-    </w:p>
-    <w:p>
-      <w:pPr>
-        <w:numPr>
-          <w:ilvl w:val="0"/>
-          <w:numId w:val="6"/>
-        </w:numPr>
-        <w:spacing w:after="0" w:afterAutospacing="0" w:before="240" w:lineRule="auto"/>
-        <w:ind w:left="720" w:hanging="360"/>
-      </w:pPr>
-      <w:r>
-        <w:rPr>
-          <w:b w:val="1"/>
-          <w:rtl w:val="0"/>
-        </w:rPr>
-        <w:t xml:space="preserve">Historias completadas (marcadas en verde):</w:t>
-      </w:r>
-      <w:r>
-        <w:rPr>
-          <w:rtl w:val="0"/>
-        </w:rPr>
-        <w:t xml:space="preserve"> funcionalidades esenciales como login, registro, panel principal, carga de resultados y consulta individual.</w:t>
-        <w:br w:type="textWrapping"/>
-      </w:r>
-    </w:p>
-    <w:p>
-      <w:pPr>
-        <w:numPr>
-          <w:ilvl w:val="0"/>
-          <w:numId w:val="6"/>
-        </w:numPr>
-        <w:spacing w:after="240" w:before="0" w:beforeAutospacing="0" w:lineRule="auto"/>
-        <w:ind w:left="720" w:hanging="360"/>
-      </w:pPr>
-      <w:r>
-        <w:rPr>
-          <w:b w:val="1"/>
-          <w:rtl w:val="0"/>
-        </w:rPr>
-        <w:t xml:space="preserve">Historias pendientes (marcadas en amarillo):</w:t>
-      </w:r>
-      <w:r>
-        <w:rPr>
-          <w:rtl w:val="0"/>
-        </w:rPr>
-        <w:t xml:space="preserve"> optimización del panel administrativo, mejora del filtrado de exámenes y diseño final responsivo.</w:t>
-        <w:br w:type="textWrapping"/>
-      </w:r>
-    </w:p>
-    <w:p>
-      <w:pPr>
-        <w:pStyle w:val="Heading4"/>
-        <w:keepNext w:val="0"/>
-        <w:keepLines w:val="0"/>
-        <w:spacing w:after="40" w:before="240" w:lineRule="auto"/>
-        <w:rPr>
-          <w:b w:val="1"/>
-          <w:color w:val="000000"/>
-          <w:sz w:val="22"/>
-          <w:szCs w:val="22"/>
-        </w:rPr>
-      </w:pPr>
-      <w:bookmarkStart w:colFirst="0" w:colLast="0" w:name="_g6nr5vac9dnk" w:id="17"/>
-      <w:bookmarkEnd w:id="17"/>
-      <w:r>
-        <w:rPr>
-          <w:b w:val="1"/>
-          <w:color w:val="000000"/>
-          <w:sz w:val="22"/>
-          <w:szCs w:val="22"/>
-          <w:rtl w:val="0"/>
-        </w:rPr>
-        <w:t xml:space="preserve">4.6 Evidencias de avance&lt;- FALTA FALTA LFALTA FALTA FALTA</w:t>
-      </w:r>
-    </w:p>
-    <w:p>
-      <w:pPr>
-        <w:spacing w:after="240" w:before="240" w:lineRule="auto"/>
-        <w:rPr/>
-      </w:pPr>
-      <w:r>
-        <w:rPr>
-          <w:rtl w:val="0"/>
-        </w:rPr>
-      </w:r>
-    </w:p>
-    <w:p>
-      <w:pPr>
-        <w:spacing w:after="240" w:before="240" w:lineRule="auto"/>
+        <w:t xml:space="preserve">4.6 Evidencias de avance</w:t>
+      </w:r>
+    </w:p>
+    <w:p>
+      <w:pPr>
+        <w:rPr/>
+      </w:pPr>
+      <w:r>
+        <w:rPr>
+          <w:rtl w:val="0"/>
+        </w:rPr>
+        <w:t xml:space="preserve">Como evidencia del avance del proyecto se presentarán capturas del mockup en Figma, de la base de datos, del archivo de historias de usuario y del cronograma de desarrollo. Estas evidencias reflejan el progreso tanto en el diseño visual y funcional como en la planificación técnica y organizativa del sistema.</w:t>
+      </w:r>
+    </w:p>
+    <w:p>
+      <w:pPr>
+        <w:rPr/>
+      </w:pPr>
+      <w:r>
+        <w:rPr>
+          <w:rtl w:val="0"/>
+        </w:rPr>
+      </w:r>
+    </w:p>
+    <w:p>
+      <w:pPr>
+        <w:rPr/>
+      </w:pPr>
+      <w:r>
+        <w:rPr>
+          <w:rtl w:val="0"/>
+        </w:rPr>
+        <w:t xml:space="preserve">El mockup muestra la estructura y experiencia de usuario; la base de datos evidencia la correcta implementación y organización de la información; las historias de usuario representan la gestión ágil de requerimientos; y el cronograma muestra la planificación por sprints y distribución de tareas.</w:t>
+      </w:r>
+    </w:p>
+    <w:p>
+      <w:pPr>
+        <w:rPr/>
+      </w:pPr>
+      <w:r>
+        <w:rPr>
+          <w:rtl w:val="0"/>
+        </w:rPr>
+      </w:r>
+    </w:p>
+    <w:p>
+      <w:pPr>
+        <w:rPr/>
+      </w:pPr>
+      <w:r>
+        <w:rPr>
+          <w:rtl w:val="0"/>
+        </w:rPr>
+        <w:t xml:space="preserve">Se resguardó la calidad del proyecto aplicando metodologías y herramientas propias de la disciplina, como diseño centrado en el usuario, modelado relacional, y Scrum para la gestión del desarrollo, asegurando coherencia y cumplimiento de los objetivos del sistema.</w:t>
+      </w:r>
+    </w:p>
+    <w:p>
+      <w:pPr>
+        <w:rPr/>
+      </w:pPr>
+      <w:r>
+        <w:rPr>
+          <w:rtl w:val="0"/>
+        </w:rPr>
+      </w:r>
+    </w:p>
+    <w:p>
+      <w:pPr>
+        <w:rPr/>
+      </w:pPr>
+      <w:r>
+        <w:rPr>
+          <w:rtl w:val="0"/>
+        </w:rPr>
+      </w:r>
+    </w:p>
+    <w:p>
+      <w:pPr>
+        <w:rPr/>
+      </w:pPr>
+      <w:r>
+        <w:rPr>
+          <w:rtl w:val="0"/>
+        </w:rPr>
+      </w:r>
+    </w:p>
+    <w:p>
+      <w:pPr>
+        <w:rPr/>
+      </w:pPr>
+      <w:r>
+        <w:rPr>
+          <w:rtl w:val="0"/>
+        </w:rPr>
+      </w:r>
+    </w:p>
+    <w:p>
+      <w:pPr>
+        <w:rPr/>
+      </w:pPr>
+      <w:r>
+        <w:rPr>
+          <w:rtl w:val="0"/>
+        </w:rPr>
+      </w:r>
+    </w:p>
+    <w:p>
+      <w:pPr>
+        <w:rPr/>
+      </w:pPr>
+      <w:r>
+        <w:rPr>
+          <w:rtl w:val="0"/>
+        </w:rPr>
+      </w:r>
+    </w:p>
+    <w:p>
+      <w:pPr>
+        <w:rPr/>
+      </w:pPr>
+      <w:r>
+        <w:rPr>
+          <w:rtl w:val="0"/>
+        </w:rPr>
+      </w:r>
+    </w:p>
+    <w:p>
+      <w:pPr>
         <w:rPr/>
       </w:pPr>
       <w:r>
@@ -1466,8 +2959,8 @@
           <w:szCs w:val="26"/>
         </w:rPr>
       </w:pPr>
-      <w:bookmarkStart w:colFirst="0" w:colLast="0" w:name="_ld2yur9l2ueb" w:id="18"/>
-      <w:bookmarkEnd w:id="18"/>
+      <w:bookmarkStart w:colFirst="0" w:colLast="0" w:name="_ld2yur9l2ueb" w:id="22"/>
+      <w:bookmarkEnd w:id="22"/>
       <w:r>
         <w:rPr>
           <w:b w:val="1"/>
@@ -1501,6 +2994,28 @@
           <w:rtl w:val="0"/>
         </w:rPr>
         <w:t xml:space="preserve">A pesar de las dificultades iniciales, se alcanzó un alto nivel de avance en las historias de usuario esenciales, cumpliendo los objetivos del taller y dejando una base estable para su futura expansión. El trabajo en equipo, la comunicación constante y la organización metodológica fueron factores determinantes para el éxito parcial del proyecto.</w:t>
+      </w:r>
+    </w:p>
+    <w:p>
+      <w:pPr>
+        <w:spacing w:after="240" w:before="240" w:lineRule="auto"/>
+        <w:rPr/>
+      </w:pPr>
+      <w:r>
+        <w:rPr>
+          <w:rtl w:val="0"/>
+        </w:rPr>
+      </w:r>
+    </w:p>
+    <w:p>
+      <w:pPr>
+        <w:spacing w:after="240" w:before="240" w:lineRule="auto"/>
+        <w:rPr/>
+      </w:pPr>
+      <w:r>
+        <w:rPr>
+          <w:rtl w:val="0"/>
+        </w:rPr>
       </w:r>
     </w:p>
     <w:p>
@@ -1549,8 +3064,8 @@
           <w:szCs w:val="26"/>
         </w:rPr>
       </w:pPr>
-      <w:bookmarkStart w:colFirst="0" w:colLast="0" w:name="_6e8zkcfd8p9k" w:id="19"/>
-      <w:bookmarkEnd w:id="19"/>
+      <w:bookmarkStart w:colFirst="0" w:colLast="0" w:name="_6e8zkcfd8p9k" w:id="23"/>
+      <w:bookmarkEnd w:id="23"/>
       <w:r>
         <w:rPr>
           <w:b w:val="1"/>
@@ -1619,7 +3134,18 @@
         <w:rPr>
           <w:rtl w:val="0"/>
         </w:rPr>
-        <w:t xml:space="preserve"> Mi participación en la gestión de la base de datos, autenticación y documentación me permitió adquirir nuevos conocimientos sobre la administración de Supabase y su ecosistema. Destaco la importancia del trabajo en equipo y la planificación semanal, que ayudaron a cumplir los objetivos del taller de manera ordenada y efectiva.</w:t>
+        <w:t xml:space="preserve">Mi participación en la gestión de la base de datos, autenticación y documentación me permitió adquirir nuevos conocimientos sobre la administración de Supabase y la versatilidad que ofrece este BaaS. Uno de ellos son las Edge Functions, que nos ahorran mucho tiempo y resultan muy eficientes en tareas que requieren alta seguridad y rendimiento. Además, fue la primera instancia en la que trabajé con funciones de IA, gestionando todo el flujo de su utilización y su ecosistema. Destaco también la importancia del trabajo en equipo y la planificación semanal, que nos permitió cumplir los objetivos del taller de manera ordenada y efectiva.</w:t>
+      </w:r>
+    </w:p>
+    <w:p>
+      <w:pPr>
+        <w:spacing w:after="240" w:before="240" w:lineRule="auto"/>
+        <w:rPr/>
+      </w:pPr>
+      <w:r>
+        <w:rPr>
+          <w:rtl w:val="0"/>
+        </w:rPr>
       </w:r>
     </w:p>
     <w:p>
@@ -2097,8 +3623,8 @@
   <w:abstractNum w:abstractNumId="5">
     <w:lvl w:ilvl="0">
       <w:start w:val="1"/>
-      <w:numFmt w:val="bullet"/>
-      <w:lvlText w:val="●"/>
+      <w:numFmt w:val="decimal"/>
+      <w:lvlText w:val="%1."/>
       <w:lvlJc w:val="left"/>
       <w:pPr>
         <w:ind w:left="720" w:hanging="360"/>
@@ -2109,8 +3635,8 @@
     </w:lvl>
     <w:lvl w:ilvl="1">
       <w:start w:val="1"/>
-      <w:numFmt w:val="bullet"/>
-      <w:lvlText w:val="○"/>
+      <w:numFmt w:val="lowerLetter"/>
+      <w:lvlText w:val="%2."/>
       <w:lvlJc w:val="left"/>
       <w:pPr>
         <w:ind w:left="1440" w:hanging="360"/>
@@ -2121,9 +3647,9 @@
     </w:lvl>
     <w:lvl w:ilvl="2">
       <w:start w:val="1"/>
-      <w:numFmt w:val="bullet"/>
-      <w:lvlText w:val="■"/>
-      <w:lvlJc w:val="left"/>
+      <w:numFmt w:val="lowerRoman"/>
+      <w:lvlText w:val="%3."/>
+      <w:lvlJc w:val="right"/>
       <w:pPr>
         <w:ind w:left="2160" w:hanging="360"/>
       </w:pPr>
@@ -2133,8 +3659,8 @@
     </w:lvl>
     <w:lvl w:ilvl="3">
       <w:start w:val="1"/>
-      <w:numFmt w:val="bullet"/>
-      <w:lvlText w:val="●"/>
+      <w:numFmt w:val="decimal"/>
+      <w:lvlText w:val="%4."/>
       <w:lvlJc w:val="left"/>
       <w:pPr>
         <w:ind w:left="2880" w:hanging="360"/>
@@ -2145,8 +3671,8 @@
     </w:lvl>
     <w:lvl w:ilvl="4">
       <w:start w:val="1"/>
-      <w:numFmt w:val="bullet"/>
-      <w:lvlText w:val="○"/>
+      <w:numFmt w:val="lowerLetter"/>
+      <w:lvlText w:val="%5."/>
       <w:lvlJc w:val="left"/>
       <w:pPr>
         <w:ind w:left="3600" w:hanging="360"/>
@@ -2157,9 +3683,9 @@
     </w:lvl>
     <w:lvl w:ilvl="5">
       <w:start w:val="1"/>
-      <w:numFmt w:val="bullet"/>
-      <w:lvlText w:val="■"/>
-      <w:lvlJc w:val="left"/>
+      <w:numFmt w:val="lowerRoman"/>
+      <w:lvlText w:val="%6."/>
+      <w:lvlJc w:val="right"/>
       <w:pPr>
         <w:ind w:left="4320" w:hanging="360"/>
       </w:pPr>
@@ -2169,8 +3695,8 @@
     </w:lvl>
     <w:lvl w:ilvl="6">
       <w:start w:val="1"/>
-      <w:numFmt w:val="bullet"/>
-      <w:lvlText w:val="●"/>
+      <w:numFmt w:val="decimal"/>
+      <w:lvlText w:val="%7."/>
       <w:lvlJc w:val="left"/>
       <w:pPr>
         <w:ind w:left="5040" w:hanging="360"/>
@@ -2181,8 +3707,8 @@
     </w:lvl>
     <w:lvl w:ilvl="7">
       <w:start w:val="1"/>
-      <w:numFmt w:val="bullet"/>
-      <w:lvlText w:val="○"/>
+      <w:numFmt w:val="lowerLetter"/>
+      <w:lvlText w:val="%8."/>
       <w:lvlJc w:val="left"/>
       <w:pPr>
         <w:ind w:left="5760" w:hanging="360"/>
@@ -2193,9 +3719,9 @@
     </w:lvl>
     <w:lvl w:ilvl="8">
       <w:start w:val="1"/>
-      <w:numFmt w:val="bullet"/>
-      <w:lvlText w:val="■"/>
-      <w:lvlJc w:val="left"/>
+      <w:numFmt w:val="lowerRoman"/>
+      <w:lvlText w:val="%9."/>
+      <w:lvlJc w:val="right"/>
       <w:pPr>
         <w:ind w:left="6480" w:hanging="360"/>
       </w:pPr>

</xml_diff>